<commit_message>
Extend RBI model to GRB: naphthenic mechanism, refinery production parameters, corrected LSE/DPN/CAA definitions
Co-Authored-By: Claude Sonnet 5.5 <noreply@anthropic.com>
Claude-Session: https://claude.ai/code/session_01HcbnVyHFWjMv5iL4iw2dZn
</commit_message>
<xml_diff>
--- a/RBI_Barrancabermeja/RBI_Metodologia_Barrancabermeja.docx
+++ b/RBI_Barrancabermeja/RBI_Metodologia_Barrancabermeja.docx
@@ -7882,7 +7882,977 @@
           <w:sz w:val="21"/>
           <w:szCs w:val="21"/>
         </w:rPr>
-        <w:t xml:space="preserve">9. Glosario</w:t>
+        <w:t xml:space="preserve">9. Extrapolación a la refinería de Barrancabermeja (250.000 bpd, 52 unidades) y correcciones al borrador</w:t>
+      </w:r>
+    </w:p>
+    <w:p>
+      <w:pPr>
+        <w:spacing w:after="30" w:before="0" w:line="250"/>
+      </w:pPr>
+      <w:r>
+        <w:rPr>
+          <w:rFonts w:ascii="Arial" w:cs="Arial" w:eastAsia="Arial" w:hAnsi="Arial"/>
+          <w:b/>
+          <w:bCs/>
+          <w:sz w:val="19"/>
+          <w:szCs w:val="19"/>
+        </w:rPr>
+        <w:t xml:space="preserve">Producción diferida a escala GRB:</w:t>
+      </w:r>
+      <w:r>
+        <w:rPr>
+          <w:rFonts w:ascii="Arial" w:cs="Arial" w:eastAsia="Arial" w:hAnsi="Arial"/>
+          <w:sz w:val="19"/>
+          <w:szCs w:val="19"/>
+        </w:rPr>
+        <w:t xml:space="preserve"> FCprod = días de parada × Capacidad × Margen × f_carga. Capacidad 250.000 bpd (dato suyo; 52 unidades también es dato suyo, no verificado), margen 8 USD/bbl (</w:t>
+      </w:r>
+      <w:r>
+        <w:rPr>
+          <w:rFonts w:ascii="Arial" w:cs="Arial" w:eastAsia="Arial" w:hAnsi="Arial"/>
+          <w:b/>
+          <w:bCs/>
+          <w:sz w:val="19"/>
+          <w:szCs w:val="19"/>
+        </w:rPr>
+        <w:t xml:space="preserve">supuesto ilustrativo</w:t>
+      </w:r>
+      <w:r>
+        <w:rPr>
+          <w:rFonts w:ascii="Arial" w:cs="Arial" w:eastAsia="Arial" w:hAnsi="Arial"/>
+          <w:sz w:val="19"/>
+          <w:szCs w:val="19"/>
+        </w:rPr>
+        <w:t xml:space="preserve">, sustituir por el margen de planeación) y f_carga = fracción de la carga que depende del equipo. Con f_carga = 20 % resultan 400.000 USD/día, diez veces el valor del paper (40.000 USD/día), por lo que en equipos críticos FCprod domina el FC y empuja la consecuencia a D o E. </w:t>
+      </w:r>
+      <w:r>
+        <w:rPr>
+          <w:rFonts w:ascii="Arial" w:cs="Arial" w:eastAsia="Arial" w:hAnsi="Arial"/>
+          <w:b/>
+          <w:bCs/>
+          <w:sz w:val="19"/>
+          <w:szCs w:val="19"/>
+        </w:rPr>
+        <w:t xml:space="preserve">Mecanismos dominantes:</w:t>
+      </w:r>
+      <w:r>
+        <w:rPr>
+          <w:rFonts w:ascii="Arial" w:cs="Arial" w:eastAsia="Arial" w:hAnsi="Arial"/>
+          <w:sz w:val="19"/>
+          <w:szCs w:val="19"/>
+        </w:rPr>
+        <w:t xml:space="preserve"> sulfidación y corrosión nafténica se tratan como adelgazamiento con CR específica (temperatura, contenido de azufre/TAN, velocidad; verifique el anexo de tasas de corrosión de API 581 Parte 2 y API 939-C/API 571); CUI y adelgazamiento siguen [P Ec. 3–4]. </w:t>
+      </w:r>
+      <w:r>
+        <w:rPr>
+          <w:rFonts w:ascii="Arial" w:cs="Arial" w:eastAsia="Arial" w:hAnsi="Arial"/>
+          <w:b/>
+          <w:bCs/>
+          <w:sz w:val="19"/>
+          <w:szCs w:val="19"/>
+        </w:rPr>
+        <w:t xml:space="preserve">Ejemplo GRB (fila C-1102, torre de vacío, nafténica; datos ilustrativos):</w:t>
+      </w:r>
+      <w:r>
+        <w:rPr>
+          <w:rFonts w:ascii="Arial" w:cs="Arial" w:eastAsia="Arial" w:hAnsi="Arial"/>
+          <w:sz w:val="19"/>
+          <w:szCs w:val="19"/>
+        </w:rPr>
+        <w:t xml:space="preserve"> CR 0,4 mm/año, t = 20 mm, última inspección 2018 ⇒ Art = 0,4·8/20 = 0,16 ⇒ DF = 20; POF = 9,68E-06·20 = 1,9E-04; FC = 8 MUSD (D) ⇒ riesgo 1.548 USD/año (2D). Inspección B y FFS nivel 1 apto/pasa ⇒ DF = máx(1; 20·0,3·0,05) = 1 ⇒ 77 USD/año (1D) ⇒ RR = 1.471 USD/año; con ahorro por diferimiento, SIR = 7,2. </w:t>
+      </w:r>
+      <w:r>
+        <w:rPr>
+          <w:rFonts w:ascii="Arial" w:cs="Arial" w:eastAsia="Arial" w:hAnsi="Arial"/>
+          <w:b/>
+          <w:bCs/>
+          <w:sz w:val="19"/>
+          <w:szCs w:val="19"/>
+        </w:rPr>
+        <w:t xml:space="preserve">Escalamiento:</w:t>
+      </w:r>
+      <w:r>
+        <w:rPr>
+          <w:rFonts w:ascii="Arial" w:cs="Arial" w:eastAsia="Arial" w:hAnsi="Arial"/>
+          <w:sz w:val="19"/>
+          <w:szCs w:val="19"/>
+        </w:rPr>
+        <w:t xml:space="preserve"> (1) cribado RAM cualitativo de todos los recipientes de las 52 unidades; (2) cálculo cuantitativo de los de nivel ≥ 3 o consecuencia ≥ D; (3) una fila por recipiente (insertar filas antes de los totales) y suma por planta. No calculé totales de refinería: no hay inventario real y las 7 filas son ilustrativas.</w:t>
+      </w:r>
+    </w:p>
+    <w:tbl>
+      <w:tblPr>
+        <w:tblW w:type="dxa" w:w="10412"/>
+        <w:tblBorders>
+          <w:top w:val="single" w:color="auto" w:sz="4"/>
+          <w:left w:val="single" w:color="auto" w:sz="4"/>
+          <w:bottom w:val="single" w:color="auto" w:sz="4"/>
+          <w:right w:val="single" w:color="auto" w:sz="4"/>
+          <w:insideH w:val="single" w:color="auto" w:sz="4"/>
+          <w:insideV w:val="single" w:color="auto" w:sz="4"/>
+        </w:tblBorders>
+      </w:tblPr>
+      <w:tblGrid>
+        <w:gridCol w:w="2300"/>
+        <w:gridCol w:w="4100"/>
+        <w:gridCol w:w="4012"/>
+      </w:tblGrid>
+      <w:tr>
+        <w:trPr>
+          <w:cantSplit/>
+          <w:tblHeader/>
+        </w:trPr>
+        <w:tc>
+          <w:tcPr>
+            <w:tcW w:type="dxa" w:w="2300"/>
+            <w:tcBorders>
+              <w:top w:val="single" w:color="BFBFBF" w:sz="4"/>
+              <w:left w:val="single" w:color="BFBFBF" w:sz="4"/>
+              <w:bottom w:val="single" w:color="BFBFBF" w:sz="4"/>
+              <w:right w:val="single" w:color="BFBFBF" w:sz="4"/>
+            </w:tcBorders>
+            <w:shd w:fill="1F3A5F" w:val="clear"/>
+            <w:tcMar>
+              <w:top w:type="dxa" w:w="25"/>
+              <w:left w:type="dxa" w:w="60"/>
+              <w:bottom w:type="dxa" w:w="25"/>
+              <w:right w:type="dxa" w:w="60"/>
+            </w:tcMar>
+          </w:tcPr>
+          <w:p>
+            <w:pPr>
+              <w:spacing w:after="0" w:line="220"/>
+            </w:pPr>
+            <w:r>
+              <w:rPr>
+                <w:rFonts w:ascii="Arial" w:cs="Arial" w:eastAsia="Arial" w:hAnsi="Arial"/>
+                <w:b/>
+                <w:bCs/>
+                <w:color w:val="FFFFFF"/>
+                <w:sz w:val="16"/>
+                <w:szCs w:val="16"/>
+              </w:rPr>
+              <w:t xml:space="preserve">Tema</w:t>
+            </w:r>
+          </w:p>
+        </w:tc>
+        <w:tc>
+          <w:tcPr>
+            <w:tcW w:type="dxa" w:w="4100"/>
+            <w:tcBorders>
+              <w:top w:val="single" w:color="BFBFBF" w:sz="4"/>
+              <w:left w:val="single" w:color="BFBFBF" w:sz="4"/>
+              <w:bottom w:val="single" w:color="BFBFBF" w:sz="4"/>
+              <w:right w:val="single" w:color="BFBFBF" w:sz="4"/>
+            </w:tcBorders>
+            <w:shd w:fill="1F3A5F" w:val="clear"/>
+            <w:tcMar>
+              <w:top w:type="dxa" w:w="25"/>
+              <w:left w:type="dxa" w:w="60"/>
+              <w:bottom w:type="dxa" w:w="25"/>
+              <w:right w:type="dxa" w:w="60"/>
+            </w:tcMar>
+          </w:tcPr>
+          <w:p>
+            <w:pPr>
+              <w:spacing w:after="0" w:line="220"/>
+            </w:pPr>
+            <w:r>
+              <w:rPr>
+                <w:rFonts w:ascii="Arial" w:cs="Arial" w:eastAsia="Arial" w:hAnsi="Arial"/>
+                <w:b/>
+                <w:bCs/>
+                <w:color w:val="FFFFFF"/>
+                <w:sz w:val="16"/>
+                <w:szCs w:val="16"/>
+              </w:rPr>
+              <w:t xml:space="preserve">Borrador ejecutivo</w:t>
+            </w:r>
+          </w:p>
+        </w:tc>
+        <w:tc>
+          <w:tcPr>
+            <w:tcW w:type="dxa" w:w="4012"/>
+            <w:tcBorders>
+              <w:top w:val="single" w:color="BFBFBF" w:sz="4"/>
+              <w:left w:val="single" w:color="BFBFBF" w:sz="4"/>
+              <w:bottom w:val="single" w:color="BFBFBF" w:sz="4"/>
+              <w:right w:val="single" w:color="BFBFBF" w:sz="4"/>
+            </w:tcBorders>
+            <w:shd w:fill="1F3A5F" w:val="clear"/>
+            <w:tcMar>
+              <w:top w:type="dxa" w:w="25"/>
+              <w:left w:type="dxa" w:w="60"/>
+              <w:bottom w:type="dxa" w:w="25"/>
+              <w:right w:type="dxa" w:w="60"/>
+            </w:tcMar>
+          </w:tcPr>
+          <w:p>
+            <w:pPr>
+              <w:spacing w:after="0" w:line="220"/>
+            </w:pPr>
+            <w:r>
+              <w:rPr>
+                <w:rFonts w:ascii="Arial" w:cs="Arial" w:eastAsia="Arial" w:hAnsi="Arial"/>
+                <w:b/>
+                <w:bCs/>
+                <w:color w:val="FFFFFF"/>
+                <w:sz w:val="16"/>
+                <w:szCs w:val="16"/>
+              </w:rPr>
+              <w:t xml:space="preserve">Corrección adoptada en esta metodología</w:t>
+            </w:r>
+          </w:p>
+        </w:tc>
+      </w:tr>
+      <w:tr>
+        <w:trPr>
+          <w:cantSplit/>
+          <w:tblHeader w:val="off"/>
+        </w:trPr>
+        <w:tc>
+          <w:tcPr>
+            <w:tcW w:type="dxa" w:w="2300"/>
+            <w:tcBorders>
+              <w:top w:val="single" w:color="BFBFBF" w:sz="4"/>
+              <w:left w:val="single" w:color="BFBFBF" w:sz="4"/>
+              <w:bottom w:val="single" w:color="BFBFBF" w:sz="4"/>
+              <w:right w:val="single" w:color="BFBFBF" w:sz="4"/>
+            </w:tcBorders>
+            <w:tcMar>
+              <w:top w:type="dxa" w:w="25"/>
+              <w:left w:type="dxa" w:w="60"/>
+              <w:bottom w:type="dxa" w:w="25"/>
+              <w:right w:type="dxa" w:w="60"/>
+            </w:tcMar>
+          </w:tcPr>
+          <w:p>
+            <w:pPr>
+              <w:spacing w:after="0" w:line="220"/>
+            </w:pPr>
+            <w:r>
+              <w:rPr>
+                <w:rFonts w:ascii="Arial" w:cs="Arial" w:eastAsia="Arial" w:hAnsi="Arial"/>
+                <w:b w:val="false"/>
+                <w:bCs w:val="false"/>
+                <w:sz w:val="16"/>
+                <w:szCs w:val="16"/>
+              </w:rPr>
+              <w:t xml:space="preserve">LSE</w:t>
+            </w:r>
+          </w:p>
+        </w:tc>
+        <w:tc>
+          <w:tcPr>
+            <w:tcW w:type="dxa" w:w="4100"/>
+            <w:tcBorders>
+              <w:top w:val="single" w:color="BFBFBF" w:sz="4"/>
+              <w:left w:val="single" w:color="BFBFBF" w:sz="4"/>
+              <w:bottom w:val="single" w:color="BFBFBF" w:sz="4"/>
+              <w:right w:val="single" w:color="BFBFBF" w:sz="4"/>
+            </w:tcBorders>
+            <w:tcMar>
+              <w:top w:type="dxa" w:w="25"/>
+              <w:left w:type="dxa" w:w="60"/>
+              <w:bottom w:type="dxa" w:w="25"/>
+              <w:right w:type="dxa" w:w="60"/>
+            </w:tcMar>
+          </w:tcPr>
+          <w:p>
+            <w:pPr>
+              <w:spacing w:after="0" w:line="220"/>
+            </w:pPr>
+            <w:r>
+              <w:rPr>
+                <w:rFonts w:ascii="Arial" w:cs="Arial" w:eastAsia="Arial" w:hAnsi="Arial"/>
+                <w:b w:val="false"/>
+                <w:bCs w:val="false"/>
+                <w:sz w:val="16"/>
+                <w:szCs w:val="16"/>
+              </w:rPr>
+              <w:t xml:space="preserve">"Life Safety Economics" = Área·0,1·10.000</w:t>
+            </w:r>
+          </w:p>
+        </w:tc>
+        <w:tc>
+          <w:tcPr>
+            <w:tcW w:type="dxa" w:w="4012"/>
+            <w:tcBorders>
+              <w:top w:val="single" w:color="BFBFBF" w:sz="4"/>
+              <w:left w:val="single" w:color="BFBFBF" w:sz="4"/>
+              <w:bottom w:val="single" w:color="BFBFBF" w:sz="4"/>
+              <w:right w:val="single" w:color="BFBFBF" w:sz="4"/>
+            </w:tcBorders>
+            <w:tcMar>
+              <w:top w:type="dxa" w:w="25"/>
+              <w:left w:type="dxa" w:w="60"/>
+              <w:bottom w:type="dxa" w:w="25"/>
+              <w:right w:type="dxa" w:w="60"/>
+            </w:tcMar>
+          </w:tcPr>
+          <w:p>
+            <w:pPr>
+              <w:spacing w:after="0" w:line="220"/>
+            </w:pPr>
+            <w:r>
+              <w:rPr>
+                <w:rFonts w:ascii="Arial" w:cs="Arial" w:eastAsia="Arial" w:hAnsi="Arial"/>
+                <w:b w:val="false"/>
+                <w:bCs w:val="false"/>
+                <w:sz w:val="16"/>
+                <w:szCs w:val="16"/>
+              </w:rPr>
+              <w:t xml:space="preserve">Eso es FCinj (USD por evento). LSE = exposición esperada de vidas = POF·CA_inj·ρ (personas/año); riesgo de vida = LSE·VSL (USD/año)</w:t>
+            </w:r>
+          </w:p>
+        </w:tc>
+      </w:tr>
+      <w:tr>
+        <w:trPr>
+          <w:cantSplit/>
+          <w:tblHeader w:val="off"/>
+        </w:trPr>
+        <w:tc>
+          <w:tcPr>
+            <w:tcW w:type="dxa" w:w="2300"/>
+            <w:tcBorders>
+              <w:top w:val="single" w:color="BFBFBF" w:sz="4"/>
+              <w:left w:val="single" w:color="BFBFBF" w:sz="4"/>
+              <w:bottom w:val="single" w:color="BFBFBF" w:sz="4"/>
+              <w:right w:val="single" w:color="BFBFBF" w:sz="4"/>
+            </w:tcBorders>
+            <w:shd w:fill="F6F8FB" w:val="clear"/>
+            <w:tcMar>
+              <w:top w:type="dxa" w:w="25"/>
+              <w:left w:type="dxa" w:w="60"/>
+              <w:bottom w:type="dxa" w:w="25"/>
+              <w:right w:type="dxa" w:w="60"/>
+            </w:tcMar>
+          </w:tcPr>
+          <w:p>
+            <w:pPr>
+              <w:spacing w:after="0" w:line="220"/>
+            </w:pPr>
+            <w:r>
+              <w:rPr>
+                <w:rFonts w:ascii="Arial" w:cs="Arial" w:eastAsia="Arial" w:hAnsi="Arial"/>
+                <w:b w:val="false"/>
+                <w:bCs w:val="false"/>
+                <w:sz w:val="16"/>
+                <w:szCs w:val="16"/>
+              </w:rPr>
+              <w:t xml:space="preserve">DPN</w:t>
+            </w:r>
+          </w:p>
+        </w:tc>
+        <w:tc>
+          <w:tcPr>
+            <w:tcW w:type="dxa" w:w="4100"/>
+            <w:tcBorders>
+              <w:top w:val="single" w:color="BFBFBF" w:sz="4"/>
+              <w:left w:val="single" w:color="BFBFBF" w:sz="4"/>
+              <w:bottom w:val="single" w:color="BFBFBF" w:sz="4"/>
+              <w:right w:val="single" w:color="BFBFBF" w:sz="4"/>
+            </w:tcBorders>
+            <w:shd w:fill="F6F8FB" w:val="clear"/>
+            <w:tcMar>
+              <w:top w:type="dxa" w:w="25"/>
+              <w:left w:type="dxa" w:w="60"/>
+              <w:bottom w:type="dxa" w:w="25"/>
+              <w:right w:type="dxa" w:w="60"/>
+            </w:tcMar>
+          </w:tcPr>
+          <w:p>
+            <w:pPr>
+              <w:spacing w:after="0" w:line="220"/>
+            </w:pPr>
+            <w:r>
+              <w:rPr>
+                <w:rFonts w:ascii="Arial" w:cs="Arial" w:eastAsia="Arial" w:hAnsi="Arial"/>
+                <w:b w:val="false"/>
+                <w:bCs w:val="false"/>
+                <w:sz w:val="16"/>
+                <w:szCs w:val="16"/>
+              </w:rPr>
+              <w:t xml:space="preserve">(L·40.000) + (Área·4.000) + LSE</w:t>
+            </w:r>
+          </w:p>
+        </w:tc>
+        <w:tc>
+          <w:tcPr>
+            <w:tcW w:type="dxa" w:w="4012"/>
+            <w:tcBorders>
+              <w:top w:val="single" w:color="BFBFBF" w:sz="4"/>
+              <w:left w:val="single" w:color="BFBFBF" w:sz="4"/>
+              <w:bottom w:val="single" w:color="BFBFBF" w:sz="4"/>
+              <w:right w:val="single" w:color="BFBFBF" w:sz="4"/>
+            </w:tcBorders>
+            <w:shd w:fill="F6F8FB" w:val="clear"/>
+            <w:tcMar>
+              <w:top w:type="dxa" w:w="25"/>
+              <w:left w:type="dxa" w:w="60"/>
+              <w:bottom w:type="dxa" w:w="25"/>
+              <w:right w:type="dxa" w:w="60"/>
+            </w:tcMar>
+          </w:tcPr>
+          <w:p>
+            <w:pPr>
+              <w:spacing w:after="0" w:line="220"/>
+            </w:pPr>
+            <w:r>
+              <w:rPr>
+                <w:rFonts w:ascii="Arial" w:cs="Arial" w:eastAsia="Arial" w:hAnsi="Arial"/>
+                <w:b w:val="false"/>
+                <w:bCs w:val="false"/>
+                <w:sz w:val="16"/>
+                <w:szCs w:val="16"/>
+              </w:rPr>
+              <w:t xml:space="preserve">[P] no da costo por metro: 4.000 USD/m² es reposición y 40.000 USD/día es producción. DPN = FC·(1 − f_mit), con FC de la Ec. (6)</w:t>
+            </w:r>
+          </w:p>
+        </w:tc>
+      </w:tr>
+      <w:tr>
+        <w:trPr>
+          <w:cantSplit/>
+          <w:tblHeader w:val="off"/>
+        </w:trPr>
+        <w:tc>
+          <w:tcPr>
+            <w:tcW w:type="dxa" w:w="2300"/>
+            <w:tcBorders>
+              <w:top w:val="single" w:color="BFBFBF" w:sz="4"/>
+              <w:left w:val="single" w:color="BFBFBF" w:sz="4"/>
+              <w:bottom w:val="single" w:color="BFBFBF" w:sz="4"/>
+              <w:right w:val="single" w:color="BFBFBF" w:sz="4"/>
+            </w:tcBorders>
+            <w:tcMar>
+              <w:top w:type="dxa" w:w="25"/>
+              <w:left w:type="dxa" w:w="60"/>
+              <w:bottom w:type="dxa" w:w="25"/>
+              <w:right w:type="dxa" w:w="60"/>
+            </w:tcMar>
+          </w:tcPr>
+          <w:p>
+            <w:pPr>
+              <w:spacing w:after="0" w:line="220"/>
+            </w:pPr>
+            <w:r>
+              <w:rPr>
+                <w:rFonts w:ascii="Arial" w:cs="Arial" w:eastAsia="Arial" w:hAnsi="Arial"/>
+                <w:b w:val="false"/>
+                <w:bCs w:val="false"/>
+                <w:sz w:val="16"/>
+                <w:szCs w:val="16"/>
+              </w:rPr>
+              <w:t xml:space="preserve">Costo evitado (CEA/CAA)</w:t>
+            </w:r>
+          </w:p>
+        </w:tc>
+        <w:tc>
+          <w:tcPr>
+            <w:tcW w:type="dxa" w:w="4100"/>
+            <w:tcBorders>
+              <w:top w:val="single" w:color="BFBFBF" w:sz="4"/>
+              <w:left w:val="single" w:color="BFBFBF" w:sz="4"/>
+              <w:bottom w:val="single" w:color="BFBFBF" w:sz="4"/>
+              <w:right w:val="single" w:color="BFBFBF" w:sz="4"/>
+            </w:tcBorders>
+            <w:tcMar>
+              <w:top w:type="dxa" w:w="25"/>
+              <w:left w:type="dxa" w:w="60"/>
+              <w:bottom w:type="dxa" w:w="25"/>
+              <w:right w:type="dxa" w:w="60"/>
+            </w:tcMar>
+          </w:tcPr>
+          <w:p>
+            <w:pPr>
+              <w:spacing w:after="0" w:line="220"/>
+            </w:pPr>
+            <w:r>
+              <w:rPr>
+                <w:rFonts w:ascii="Arial" w:cs="Arial" w:eastAsia="Arial" w:hAnsi="Arial"/>
+                <w:b w:val="false"/>
+                <w:bCs w:val="false"/>
+                <w:sz w:val="16"/>
+                <w:szCs w:val="16"/>
+              </w:rPr>
+              <w:t xml:space="preserve">Δlucro cesante + Δinspección + (Riesgo TBI − Riesgo RBI)</w:t>
+            </w:r>
+          </w:p>
+        </w:tc>
+        <w:tc>
+          <w:tcPr>
+            <w:tcW w:type="dxa" w:w="4012"/>
+            <w:tcBorders>
+              <w:top w:val="single" w:color="BFBFBF" w:sz="4"/>
+              <w:left w:val="single" w:color="BFBFBF" w:sz="4"/>
+              <w:bottom w:val="single" w:color="BFBFBF" w:sz="4"/>
+              <w:right w:val="single" w:color="BFBFBF" w:sz="4"/>
+            </w:tcBorders>
+            <w:tcMar>
+              <w:top w:type="dxa" w:w="25"/>
+              <w:left w:type="dxa" w:w="60"/>
+              <w:bottom w:type="dxa" w:w="25"/>
+              <w:right w:type="dxa" w:w="60"/>
+            </w:tcMar>
+          </w:tcPr>
+          <w:p>
+            <w:pPr>
+              <w:spacing w:after="0" w:line="220"/>
+            </w:pPr>
+            <w:r>
+              <w:rPr>
+                <w:rFonts w:ascii="Arial" w:cs="Arial" w:eastAsia="Arial" w:hAnsi="Arial"/>
+                <w:b w:val="false"/>
+                <w:bCs w:val="false"/>
+                <w:sz w:val="16"/>
+                <w:szCs w:val="16"/>
+              </w:rPr>
+              <w:t xml:space="preserve">Suma doble: el lucro cesante por falla ya está en el riesgo. CAA = RR + AD, con AD solo por paradas e inspecciones diferidas</w:t>
+            </w:r>
+          </w:p>
+        </w:tc>
+      </w:tr>
+      <w:tr>
+        <w:trPr>
+          <w:cantSplit/>
+          <w:tblHeader w:val="off"/>
+        </w:trPr>
+        <w:tc>
+          <w:tcPr>
+            <w:tcW w:type="dxa" w:w="2300"/>
+            <w:tcBorders>
+              <w:top w:val="single" w:color="BFBFBF" w:sz="4"/>
+              <w:left w:val="single" w:color="BFBFBF" w:sz="4"/>
+              <w:bottom w:val="single" w:color="BFBFBF" w:sz="4"/>
+              <w:right w:val="single" w:color="BFBFBF" w:sz="4"/>
+            </w:tcBorders>
+            <w:shd w:fill="F6F8FB" w:val="clear"/>
+            <w:tcMar>
+              <w:top w:type="dxa" w:w="25"/>
+              <w:left w:type="dxa" w:w="60"/>
+              <w:bottom w:type="dxa" w:w="25"/>
+              <w:right w:type="dxa" w:w="60"/>
+            </w:tcMar>
+          </w:tcPr>
+          <w:p>
+            <w:pPr>
+              <w:spacing w:after="0" w:line="220"/>
+            </w:pPr>
+            <w:r>
+              <w:rPr>
+                <w:rFonts w:ascii="Arial" w:cs="Arial" w:eastAsia="Arial" w:hAnsi="Arial"/>
+                <w:b w:val="false"/>
+                <w:bCs w:val="false"/>
+                <w:sz w:val="16"/>
+                <w:szCs w:val="16"/>
+              </w:rPr>
+              <w:t xml:space="preserve">Efecto de inspección A</w:t>
+            </w:r>
+          </w:p>
+        </w:tc>
+        <w:tc>
+          <w:tcPr>
+            <w:tcW w:type="dxa" w:w="4100"/>
+            <w:tcBorders>
+              <w:top w:val="single" w:color="BFBFBF" w:sz="4"/>
+              <w:left w:val="single" w:color="BFBFBF" w:sz="4"/>
+              <w:bottom w:val="single" w:color="BFBFBF" w:sz="4"/>
+              <w:right w:val="single" w:color="BFBFBF" w:sz="4"/>
+            </w:tcBorders>
+            <w:shd w:fill="F6F8FB" w:val="clear"/>
+            <w:tcMar>
+              <w:top w:type="dxa" w:w="25"/>
+              <w:left w:type="dxa" w:w="60"/>
+              <w:bottom w:type="dxa" w:w="25"/>
+              <w:right w:type="dxa" w:w="60"/>
+            </w:tcMar>
+          </w:tcPr>
+          <w:p>
+            <w:pPr>
+              <w:spacing w:after="0" w:line="220"/>
+            </w:pPr>
+            <w:r>
+              <w:rPr>
+                <w:rFonts w:ascii="Arial" w:cs="Arial" w:eastAsia="Arial" w:hAnsi="Arial"/>
+                <w:b w:val="false"/>
+                <w:bCs w:val="false"/>
+                <w:sz w:val="16"/>
+                <w:szCs w:val="16"/>
+              </w:rPr>
+              <w:t xml:space="preserve">"Desploma el POF"</w:t>
+            </w:r>
+          </w:p>
+        </w:tc>
+        <w:tc>
+          <w:tcPr>
+            <w:tcW w:type="dxa" w:w="4012"/>
+            <w:tcBorders>
+              <w:top w:val="single" w:color="BFBFBF" w:sz="4"/>
+              <w:left w:val="single" w:color="BFBFBF" w:sz="4"/>
+              <w:bottom w:val="single" w:color="BFBFBF" w:sz="4"/>
+              <w:right w:val="single" w:color="BFBFBF" w:sz="4"/>
+            </w:tcBorders>
+            <w:shd w:fill="F6F8FB" w:val="clear"/>
+            <w:tcMar>
+              <w:top w:type="dxa" w:w="25"/>
+              <w:left w:type="dxa" w:w="60"/>
+              <w:bottom w:type="dxa" w:w="25"/>
+              <w:right w:type="dxa" w:w="60"/>
+            </w:tcMar>
+          </w:tcPr>
+          <w:p>
+            <w:pPr>
+              <w:spacing w:after="0" w:line="220"/>
+            </w:pPr>
+            <w:r>
+              <w:rPr>
+                <w:rFonts w:ascii="Arial" w:cs="Arial" w:eastAsia="Arial" w:hAnsi="Arial"/>
+                <w:b w:val="false"/>
+                <w:bCs w:val="false"/>
+                <w:sz w:val="16"/>
+                <w:szCs w:val="16"/>
+              </w:rPr>
+              <w:t xml:space="preserve">−90 % del DF (confianza 80–100 %, [P Tabla 1]); el valor real sale de recalcular el DF con los datos hallados</w:t>
+            </w:r>
+          </w:p>
+        </w:tc>
+      </w:tr>
+      <w:tr>
+        <w:trPr>
+          <w:cantSplit/>
+          <w:tblHeader w:val="off"/>
+        </w:trPr>
+        <w:tc>
+          <w:tcPr>
+            <w:tcW w:type="dxa" w:w="2300"/>
+            <w:tcBorders>
+              <w:top w:val="single" w:color="BFBFBF" w:sz="4"/>
+              <w:left w:val="single" w:color="BFBFBF" w:sz="4"/>
+              <w:bottom w:val="single" w:color="BFBFBF" w:sz="4"/>
+              <w:right w:val="single" w:color="BFBFBF" w:sz="4"/>
+            </w:tcBorders>
+            <w:tcMar>
+              <w:top w:type="dxa" w:w="25"/>
+              <w:left w:type="dxa" w:w="60"/>
+              <w:bottom w:type="dxa" w:w="25"/>
+              <w:right w:type="dxa" w:w="60"/>
+            </w:tcMar>
+          </w:tcPr>
+          <w:p>
+            <w:pPr>
+              <w:spacing w:after="0" w:line="220"/>
+            </w:pPr>
+            <w:r>
+              <w:rPr>
+                <w:rFonts w:ascii="Arial" w:cs="Arial" w:eastAsia="Arial" w:hAnsi="Arial"/>
+                <w:b w:val="false"/>
+                <w:bCs w:val="false"/>
+                <w:sz w:val="16"/>
+                <w:szCs w:val="16"/>
+              </w:rPr>
+              <w:t xml:space="preserve">Ecuaciones 12 y 13 de [P]</w:t>
+            </w:r>
+          </w:p>
+        </w:tc>
+        <w:tc>
+          <w:tcPr>
+            <w:tcW w:type="dxa" w:w="4100"/>
+            <w:tcBorders>
+              <w:top w:val="single" w:color="BFBFBF" w:sz="4"/>
+              <w:left w:val="single" w:color="BFBFBF" w:sz="4"/>
+              <w:bottom w:val="single" w:color="BFBFBF" w:sz="4"/>
+              <w:right w:val="single" w:color="BFBFBF" w:sz="4"/>
+            </w:tcBorders>
+            <w:tcMar>
+              <w:top w:type="dxa" w:w="25"/>
+              <w:left w:type="dxa" w:w="60"/>
+              <w:bottom w:type="dxa" w:w="25"/>
+              <w:right w:type="dxa" w:w="60"/>
+            </w:tcMar>
+          </w:tcPr>
+          <w:p>
+            <w:pPr>
+              <w:spacing w:after="0" w:line="220"/>
+            </w:pPr>
+            <w:r>
+              <w:rPr>
+                <w:rFonts w:ascii="Arial" w:cs="Arial" w:eastAsia="Arial" w:hAnsi="Arial"/>
+                <w:b w:val="false"/>
+                <w:bCs w:val="false"/>
+                <w:sz w:val="16"/>
+                <w:szCs w:val="16"/>
+              </w:rPr>
+              <w:t xml:space="preserve">—</w:t>
+            </w:r>
+          </w:p>
+        </w:tc>
+        <w:tc>
+          <w:tcPr>
+            <w:tcW w:type="dxa" w:w="4012"/>
+            <w:tcBorders>
+              <w:top w:val="single" w:color="BFBFBF" w:sz="4"/>
+              <w:left w:val="single" w:color="BFBFBF" w:sz="4"/>
+              <w:bottom w:val="single" w:color="BFBFBF" w:sz="4"/>
+              <w:right w:val="single" w:color="BFBFBF" w:sz="4"/>
+            </w:tcBorders>
+            <w:tcMar>
+              <w:top w:type="dxa" w:w="25"/>
+              <w:left w:type="dxa" w:w="60"/>
+              <w:bottom w:type="dxa" w:w="25"/>
+              <w:right w:type="dxa" w:w="60"/>
+            </w:tcMar>
+          </w:tcPr>
+          <w:p>
+            <w:pPr>
+              <w:spacing w:after="0" w:line="220"/>
+            </w:pPr>
+            <w:r>
+              <w:rPr>
+                <w:rFonts w:ascii="Arial" w:cs="Arial" w:eastAsia="Arial" w:hAnsi="Arial"/>
+                <w:b w:val="false"/>
+                <w:bCs w:val="false"/>
+                <w:sz w:val="16"/>
+                <w:szCs w:val="16"/>
+              </w:rPr>
+              <w:t xml:space="preserve">Ec. 12: CA = máx[CA_cmd, CA_inj]; Ec. 13: FC = FCcmd+FCaffa+FCprod+FCinj+FCenviron</w:t>
+            </w:r>
+          </w:p>
+        </w:tc>
+      </w:tr>
+      <w:tr>
+        <w:trPr>
+          <w:cantSplit/>
+          <w:tblHeader w:val="off"/>
+        </w:trPr>
+        <w:tc>
+          <w:tcPr>
+            <w:tcW w:type="dxa" w:w="2300"/>
+            <w:tcBorders>
+              <w:top w:val="single" w:color="BFBFBF" w:sz="4"/>
+              <w:left w:val="single" w:color="BFBFBF" w:sz="4"/>
+              <w:bottom w:val="single" w:color="BFBFBF" w:sz="4"/>
+              <w:right w:val="single" w:color="BFBFBF" w:sz="4"/>
+            </w:tcBorders>
+            <w:shd w:fill="F6F8FB" w:val="clear"/>
+            <w:tcMar>
+              <w:top w:type="dxa" w:w="25"/>
+              <w:left w:type="dxa" w:w="60"/>
+              <w:bottom w:type="dxa" w:w="25"/>
+              <w:right w:type="dxa" w:w="60"/>
+            </w:tcMar>
+          </w:tcPr>
+          <w:p>
+            <w:pPr>
+              <w:spacing w:after="0" w:line="220"/>
+            </w:pPr>
+            <w:r>
+              <w:rPr>
+                <w:rFonts w:ascii="Arial" w:cs="Arial" w:eastAsia="Arial" w:hAnsi="Arial"/>
+                <w:b w:val="false"/>
+                <w:bCs w:val="false"/>
+                <w:sz w:val="16"/>
+                <w:szCs w:val="16"/>
+              </w:rPr>
+              <w:t xml:space="preserve">Ruta 1C → 4C → 1C</w:t>
+            </w:r>
+          </w:p>
+        </w:tc>
+        <w:tc>
+          <w:tcPr>
+            <w:tcW w:type="dxa" w:w="4100"/>
+            <w:tcBorders>
+              <w:top w:val="single" w:color="BFBFBF" w:sz="4"/>
+              <w:left w:val="single" w:color="BFBFBF" w:sz="4"/>
+              <w:bottom w:val="single" w:color="BFBFBF" w:sz="4"/>
+              <w:right w:val="single" w:color="BFBFBF" w:sz="4"/>
+            </w:tcBorders>
+            <w:shd w:fill="F6F8FB" w:val="clear"/>
+            <w:tcMar>
+              <w:top w:type="dxa" w:w="25"/>
+              <w:left w:type="dxa" w:w="60"/>
+              <w:bottom w:type="dxa" w:w="25"/>
+              <w:right w:type="dxa" w:w="60"/>
+            </w:tcMar>
+          </w:tcPr>
+          <w:p>
+            <w:pPr>
+              <w:spacing w:after="0" w:line="220"/>
+            </w:pPr>
+            <w:r>
+              <w:rPr>
+                <w:rFonts w:ascii="Arial" w:cs="Arial" w:eastAsia="Arial" w:hAnsi="Arial"/>
+                <w:b w:val="false"/>
+                <w:bCs w:val="false"/>
+                <w:sz w:val="16"/>
+                <w:szCs w:val="16"/>
+              </w:rPr>
+              <w:t xml:space="preserve">Vuelve a 1C tras RBI + FFS</w:t>
+            </w:r>
+          </w:p>
+        </w:tc>
+        <w:tc>
+          <w:tcPr>
+            <w:tcW w:type="dxa" w:w="4012"/>
+            <w:tcBorders>
+              <w:top w:val="single" w:color="BFBFBF" w:sz="4"/>
+              <w:left w:val="single" w:color="BFBFBF" w:sz="4"/>
+              <w:bottom w:val="single" w:color="BFBFBF" w:sz="4"/>
+              <w:right w:val="single" w:color="BFBFBF" w:sz="4"/>
+            </w:tcBorders>
+            <w:shd w:fill="F6F8FB" w:val="clear"/>
+            <w:tcMar>
+              <w:top w:type="dxa" w:w="25"/>
+              <w:left w:type="dxa" w:w="60"/>
+              <w:bottom w:type="dxa" w:w="25"/>
+              <w:right w:type="dxa" w:w="60"/>
+            </w:tcMar>
+          </w:tcPr>
+          <w:p>
+            <w:pPr>
+              <w:spacing w:after="0" w:line="220"/>
+            </w:pPr>
+            <w:r>
+              <w:rPr>
+                <w:rFonts w:ascii="Arial" w:cs="Arial" w:eastAsia="Arial" w:hAnsi="Arial"/>
+                <w:b w:val="false"/>
+                <w:bCs w:val="false"/>
+                <w:sz w:val="16"/>
+                <w:szCs w:val="16"/>
+              </w:rPr>
+              <w:t xml:space="preserve">En el ejemplo: 4C → 3C tras RBI (A) → 1C solo tras FFS apto y FAD pasa</w:t>
+            </w:r>
+          </w:p>
+        </w:tc>
+      </w:tr>
+      <w:tr>
+        <w:trPr>
+          <w:cantSplit/>
+          <w:tblHeader w:val="off"/>
+        </w:trPr>
+        <w:tc>
+          <w:tcPr>
+            <w:tcW w:type="dxa" w:w="2300"/>
+            <w:tcBorders>
+              <w:top w:val="single" w:color="BFBFBF" w:sz="4"/>
+              <w:left w:val="single" w:color="BFBFBF" w:sz="4"/>
+              <w:bottom w:val="single" w:color="BFBFBF" w:sz="4"/>
+              <w:right w:val="single" w:color="BFBFBF" w:sz="4"/>
+            </w:tcBorders>
+            <w:tcMar>
+              <w:top w:type="dxa" w:w="25"/>
+              <w:left w:type="dxa" w:w="60"/>
+              <w:bottom w:type="dxa" w:w="25"/>
+              <w:right w:type="dxa" w:w="60"/>
+            </w:tcMar>
+          </w:tcPr>
+          <w:p>
+            <w:pPr>
+              <w:spacing w:after="0" w:line="220"/>
+            </w:pPr>
+            <w:r>
+              <w:rPr>
+                <w:rFonts w:ascii="Arial" w:cs="Arial" w:eastAsia="Arial" w:hAnsi="Arial"/>
+                <w:b w:val="false"/>
+                <w:bCs w:val="false"/>
+                <w:sz w:val="16"/>
+                <w:szCs w:val="16"/>
+              </w:rPr>
+              <w:t xml:space="preserve">Secciones y tablas de normas</w:t>
+            </w:r>
+          </w:p>
+        </w:tc>
+        <w:tc>
+          <w:tcPr>
+            <w:tcW w:type="dxa" w:w="4100"/>
+            <w:tcBorders>
+              <w:top w:val="single" w:color="BFBFBF" w:sz="4"/>
+              <w:left w:val="single" w:color="BFBFBF" w:sz="4"/>
+              <w:bottom w:val="single" w:color="BFBFBF" w:sz="4"/>
+              <w:right w:val="single" w:color="BFBFBF" w:sz="4"/>
+            </w:tcBorders>
+            <w:tcMar>
+              <w:top w:type="dxa" w:w="25"/>
+              <w:left w:type="dxa" w:w="60"/>
+              <w:bottom w:type="dxa" w:w="25"/>
+              <w:right w:type="dxa" w:w="60"/>
+            </w:tcMar>
+          </w:tcPr>
+          <w:p>
+            <w:pPr>
+              <w:spacing w:after="0" w:line="220"/>
+            </w:pPr>
+            <w:r>
+              <w:rPr>
+                <w:rFonts w:ascii="Arial" w:cs="Arial" w:eastAsia="Arial" w:hAnsi="Arial"/>
+                <w:b w:val="false"/>
+                <w:bCs w:val="false"/>
+                <w:sz w:val="16"/>
+                <w:szCs w:val="16"/>
+              </w:rPr>
+              <w:t xml:space="preserve">Parte 2 §4, 16, 17; Tablas 4.1 y 4.2; PCC-3 §7–10</w:t>
+            </w:r>
+          </w:p>
+        </w:tc>
+        <w:tc>
+          <w:tcPr>
+            <w:tcW w:type="dxa" w:w="4012"/>
+            <w:tcBorders>
+              <w:top w:val="single" w:color="BFBFBF" w:sz="4"/>
+              <w:left w:val="single" w:color="BFBFBF" w:sz="4"/>
+              <w:bottom w:val="single" w:color="BFBFBF" w:sz="4"/>
+              <w:right w:val="single" w:color="BFBFBF" w:sz="4"/>
+            </w:tcBorders>
+            <w:tcMar>
+              <w:top w:type="dxa" w:w="25"/>
+              <w:left w:type="dxa" w:w="60"/>
+              <w:bottom w:type="dxa" w:w="25"/>
+              <w:right w:type="dxa" w:w="60"/>
+            </w:tcMar>
+          </w:tcPr>
+          <w:p>
+            <w:pPr>
+              <w:spacing w:after="0" w:line="220"/>
+            </w:pPr>
+            <w:r>
+              <w:rPr>
+                <w:rFonts w:ascii="Arial" w:cs="Arial" w:eastAsia="Arial" w:hAnsi="Arial"/>
+                <w:b w:val="false"/>
+                <w:bCs w:val="false"/>
+                <w:sz w:val="16"/>
+                <w:szCs w:val="16"/>
+              </w:rPr>
+              <w:t xml:space="preserve">Sin acceso a las normas: [P] cita las Tablas 15.2M y 16.2M (secciones 15 y 16). Confirmar en su edición</w:t>
+            </w:r>
+          </w:p>
+        </w:tc>
+      </w:tr>
+    </w:tbl>
+    <w:p>
+      <w:pPr>
+        <w:spacing w:after="40"/>
+      </w:pPr>
+    </w:p>
+    <w:p>
+      <w:pPr>
+        <w:pStyle w:val="Heading2"/>
+        <w:keepNext/>
+        <w:pBdr>
+          <w:bottom w:val="single" w:color="1F3A5F" w:sz="6" w:space="1"/>
+        </w:pBdr>
+        <w:spacing w:after="50" w:before="110"/>
+      </w:pPr>
+      <w:r>
+        <w:rPr>
+          <w:rFonts w:ascii="Arial" w:cs="Arial" w:eastAsia="Arial" w:hAnsi="Arial"/>
+          <w:b/>
+          <w:bCs/>
+          <w:color w:val="1F3A5F"/>
+          <w:sz w:val="21"/>
+          <w:szCs w:val="21"/>
+        </w:rPr>
+        <w:t xml:space="preserve">10. Glosario</w:t>
       </w:r>
     </w:p>
     <w:p>
@@ -8193,7 +9163,7 @@
           <w:sz w:val="16"/>
           <w:szCs w:val="16"/>
         </w:rPr>
-        <w:t xml:space="preserve"> exposición esperada de vidas (personas/año). </w:t>
+        <w:t xml:space="preserve"> exposición esperada de vidas (personas/año) = POF·CA_inj·ρ. </w:t>
       </w:r>
       <w:r>
         <w:rPr>

</xml_diff>

<commit_message>
Add FFS three-state, RUL, WACC/CR sensitivity, TBI vs RBI costs, plant summary, DSS flow and traceability
Co-Authored-By: Claude Sonnet 5.5 <noreply@anthropic.com>
Claude-Session: https://claude.ai/code/session_01HcbnVyHFWjMv5iL4iw2dZn
</commit_message>
<xml_diff>
--- a/RBI_Barrancabermeja/RBI_Metodologia_Barrancabermeja.docx
+++ b/RBI_Barrancabermeja/RBI_Metodologia_Barrancabermeja.docx
@@ -8852,7 +8852,2264 @@
           <w:sz w:val="21"/>
           <w:szCs w:val="21"/>
         </w:rPr>
-        <w:t xml:space="preserve">10. Glosario</w:t>
+        <w:t xml:space="preserve">10. Auditoría de fuentes, FFS de tres estados, RUL, NDE, TBI vs RBI y sensibilidades</w:t>
+      </w:r>
+    </w:p>
+    <w:p>
+      <w:pPr>
+        <w:spacing w:after="30" w:before="0" w:line="250"/>
+      </w:pPr>
+      <w:r>
+        <w:rPr>
+          <w:rFonts w:ascii="Arial" w:cs="Arial" w:eastAsia="Arial" w:hAnsi="Arial"/>
+          <w:b/>
+          <w:bCs/>
+          <w:sz w:val="19"/>
+          <w:szCs w:val="19"/>
+        </w:rPr>
+        <w:t xml:space="preserve">Clasificación de origen</w:t>
+      </w:r>
+      <w:r>
+        <w:rPr>
+          <w:rFonts w:ascii="Arial" w:cs="Arial" w:eastAsia="Arial" w:hAnsi="Arial"/>
+          <w:sz w:val="19"/>
+          <w:szCs w:val="19"/>
+        </w:rPr>
+        <w:t xml:space="preserve"> (cada fórmula con norma, parte, variables, unidades y dominio está en la pestaña "Fórmulas y trazabilidad" del tablero): </w:t>
+      </w:r>
+      <w:r>
+        <w:rPr>
+          <w:rFonts w:ascii="Arial" w:cs="Arial" w:eastAsia="Arial" w:hAnsi="Arial"/>
+          <w:b/>
+          <w:bCs/>
+          <w:sz w:val="19"/>
+          <w:szCs w:val="19"/>
+        </w:rPr>
+        <w:t xml:space="preserve">PAPER</w:t>
+      </w:r>
+      <w:r>
+        <w:rPr>
+          <w:rFonts w:ascii="Arial" w:cs="Arial" w:eastAsia="Arial" w:hAnsi="Arial"/>
+          <w:sz w:val="19"/>
+          <w:szCs w:val="19"/>
+        </w:rPr>
+        <w:t xml:space="preserve"> = ecuaciones (1)–(13), Tablas 1–10, Fig. 5–8 y valores de §2.3; </w:t>
+      </w:r>
+      <w:r>
+        <w:rPr>
+          <w:rFonts w:ascii="Arial" w:cs="Arial" w:eastAsia="Arial" w:hAnsi="Arial"/>
+          <w:b/>
+          <w:bCs/>
+          <w:sz w:val="19"/>
+          <w:szCs w:val="19"/>
+        </w:rPr>
+        <w:t xml:space="preserve">NORMA</w:t>
+      </w:r>
+      <w:r>
+        <w:rPr>
+          <w:rFonts w:ascii="Arial" w:cs="Arial" w:eastAsia="Arial" w:hAnsi="Arial"/>
+          <w:sz w:val="19"/>
+          <w:szCs w:val="19"/>
+        </w:rPr>
+        <w:t xml:space="preserve"> = lo que [P] cita de API 581 (Tablas 15.2M y 16.2M, Anexo 2.A) o lo que recuerdo sin acceso al texto (GFF 3,06E-05 de Tabla 3.1, fórmula del FMS, umbrales RAM), marcado "verificar"; </w:t>
+      </w:r>
+      <w:r>
+        <w:rPr>
+          <w:rFonts w:ascii="Arial" w:cs="Arial" w:eastAsia="Arial" w:hAnsi="Arial"/>
+          <w:b/>
+          <w:bCs/>
+          <w:sz w:val="19"/>
+          <w:szCs w:val="19"/>
+        </w:rPr>
+        <w:t xml:space="preserve">MODELO</w:t>
+      </w:r>
+      <w:r>
+        <w:rPr>
+          <w:rFonts w:ascii="Arial" w:cs="Arial" w:eastAsia="Arial" w:hAnsi="Arial"/>
+          <w:sz w:val="19"/>
+          <w:szCs w:val="19"/>
+        </w:rPr>
+        <w:t xml:space="preserve"> = definiciones propias (tabla Art→DF, f_FFS, DPN, LSE, AD, RUL); </w:t>
+      </w:r>
+      <w:r>
+        <w:rPr>
+          <w:rFonts w:ascii="Arial" w:cs="Arial" w:eastAsia="Arial" w:hAnsi="Arial"/>
+          <w:b/>
+          <w:bCs/>
+          <w:sz w:val="19"/>
+          <w:szCs w:val="19"/>
+        </w:rPr>
+        <w:t xml:space="preserve">SUPUESTO</w:t>
+      </w:r>
+      <w:r>
+        <w:rPr>
+          <w:rFonts w:ascii="Arial" w:cs="Arial" w:eastAsia="Arial" w:hAnsi="Arial"/>
+          <w:sz w:val="19"/>
+          <w:szCs w:val="19"/>
+        </w:rPr>
+        <w:t xml:space="preserve"> = margen 8 USD/bbl, CA, costos de FFS, valores por susceptibilidad. Ediciones a confirmar: API RP 581 3.ª ed. (2016; [P] la cita como 2016), API 579-1/ASME FFS-1 (2016 o 2021), ASME PCC-3 (2017), ISO 14224 (2016), ISO 15663 (partes 1–3), ISO 55001 (2014), ISO 55010 (2019). [P] cita "API RP 580 (2021)" tal cual. </w:t>
+      </w:r>
+      <w:r>
+        <w:rPr>
+          <w:rFonts w:ascii="Arial" w:cs="Arial" w:eastAsia="Arial" w:hAnsi="Arial"/>
+          <w:b/>
+          <w:bCs/>
+          <w:sz w:val="19"/>
+          <w:szCs w:val="19"/>
+        </w:rPr>
+        <w:t xml:space="preserve">ISO 15663, cuatro pasos (según su enunciado; no verificados en la norma):</w:t>
+      </w:r>
+      <w:r>
+        <w:rPr>
+          <w:rFonts w:ascii="Arial" w:cs="Arial" w:eastAsia="Arial" w:hAnsi="Arial"/>
+          <w:sz w:val="19"/>
+          <w:szCs w:val="19"/>
+        </w:rPr>
+        <w:t xml:space="preserve"> alcance → datos y costos → modelación → reporte y decisión; corresponden a Pasos 1, 2–7, 8 y 9 de la sección 3. </w:t>
+      </w:r>
+      <w:r>
+        <w:rPr>
+          <w:rFonts w:ascii="Arial" w:cs="Arial" w:eastAsia="Arial" w:hAnsi="Arial"/>
+          <w:b/>
+          <w:bCs/>
+          <w:sz w:val="19"/>
+          <w:szCs w:val="19"/>
+        </w:rPr>
+        <w:t xml:space="preserve">ISO 14224:</w:t>
+      </w:r>
+      <w:r>
+        <w:rPr>
+          <w:rFonts w:ascii="Arial" w:cs="Arial" w:eastAsia="Arial" w:hAnsi="Arial"/>
+          <w:sz w:val="19"/>
+          <w:szCs w:val="19"/>
+        </w:rPr>
+        <w:t xml:space="preserve"> estructura de datos por equipo (tag, tipo, fluido), modo de falla, mecanismo de daño, inspección y mantenimiento = columnas de entrada del Excel.</w:t>
+      </w:r>
+    </w:p>
+    <w:p>
+      <w:pPr>
+        <w:spacing w:after="30" w:before="0" w:line="250"/>
+      </w:pPr>
+      <w:r>
+        <w:rPr>
+          <w:rFonts w:ascii="Arial" w:cs="Arial" w:eastAsia="Arial" w:hAnsi="Arial"/>
+          <w:b/>
+          <w:bCs/>
+          <w:sz w:val="19"/>
+          <w:szCs w:val="19"/>
+        </w:rPr>
+        <w:t xml:space="preserve">Aviso sobre el ejemplo E-101.</w:t>
+      </w:r>
+      <w:r>
+        <w:rPr>
+          <w:rFonts w:ascii="Arial" w:cs="Arial" w:eastAsia="Arial" w:hAnsi="Arial"/>
+          <w:sz w:val="19"/>
+          <w:szCs w:val="19"/>
+        </w:rPr>
+        <w:t xml:space="preserve"> Con los datos del paper (P = 114 bar, D_i = 203 mm, S = 151 MPa, E = 1) el espesor requerido por pared delgada es t = P·R/(S·E − 0,6·P) = 11,4·101,5/(151 − 6,84) = 8,03 mm, frente a 8,3 mm medidos en 2018 [P Tabla 2]. Por eso la hoja calcula RUL &lt; 0 para el escenario de 22 años y marca "RUL&lt;0 con FFS apto: verificar". El resultado "Apto/Pasa" de E-101 es un supuesto para mostrar la mecánica 4C → 3C → 1C; en un caso real ese resultado debe salir del cálculo API 579 con datos reales, y con estos números un FFS nivel 1 no daría margen.</w:t>
+      </w:r>
+    </w:p>
+    <w:tbl>
+      <w:tblPr>
+        <w:tblW w:type="dxa" w:w="10412"/>
+        <w:tblBorders>
+          <w:top w:val="single" w:color="auto" w:sz="4"/>
+          <w:left w:val="single" w:color="auto" w:sz="4"/>
+          <w:bottom w:val="single" w:color="auto" w:sz="4"/>
+          <w:right w:val="single" w:color="auto" w:sz="4"/>
+          <w:insideH w:val="single" w:color="auto" w:sz="4"/>
+          <w:insideV w:val="single" w:color="auto" w:sz="4"/>
+        </w:tblBorders>
+      </w:tblPr>
+      <w:tblGrid>
+        <w:gridCol w:w="2100"/>
+        <w:gridCol w:w="4700"/>
+        <w:gridCol w:w="3612"/>
+      </w:tblGrid>
+      <w:tr>
+        <w:trPr>
+          <w:cantSplit/>
+          <w:tblHeader/>
+        </w:trPr>
+        <w:tc>
+          <w:tcPr>
+            <w:tcW w:type="dxa" w:w="2100"/>
+            <w:tcBorders>
+              <w:top w:val="single" w:color="BFBFBF" w:sz="4"/>
+              <w:left w:val="single" w:color="BFBFBF" w:sz="4"/>
+              <w:bottom w:val="single" w:color="BFBFBF" w:sz="4"/>
+              <w:right w:val="single" w:color="BFBFBF" w:sz="4"/>
+            </w:tcBorders>
+            <w:shd w:fill="1F3A5F" w:val="clear"/>
+            <w:tcMar>
+              <w:top w:type="dxa" w:w="25"/>
+              <w:left w:type="dxa" w:w="60"/>
+              <w:bottom w:type="dxa" w:w="25"/>
+              <w:right w:type="dxa" w:w="60"/>
+            </w:tcMar>
+          </w:tcPr>
+          <w:p>
+            <w:pPr>
+              <w:spacing w:after="0" w:line="220"/>
+            </w:pPr>
+            <w:r>
+              <w:rPr>
+                <w:rFonts w:ascii="Arial" w:cs="Arial" w:eastAsia="Arial" w:hAnsi="Arial"/>
+                <w:b/>
+                <w:bCs/>
+                <w:color w:val="FFFFFF"/>
+                <w:sz w:val="16"/>
+                <w:szCs w:val="16"/>
+              </w:rPr>
+              <w:t xml:space="preserve">Resultado FFS (API 579-1)</w:t>
+            </w:r>
+          </w:p>
+        </w:tc>
+        <w:tc>
+          <w:tcPr>
+            <w:tcW w:type="dxa" w:w="4700"/>
+            <w:tcBorders>
+              <w:top w:val="single" w:color="BFBFBF" w:sz="4"/>
+              <w:left w:val="single" w:color="BFBFBF" w:sz="4"/>
+              <w:bottom w:val="single" w:color="BFBFBF" w:sz="4"/>
+              <w:right w:val="single" w:color="BFBFBF" w:sz="4"/>
+            </w:tcBorders>
+            <w:shd w:fill="1F3A5F" w:val="clear"/>
+            <w:tcMar>
+              <w:top w:type="dxa" w:w="25"/>
+              <w:left w:type="dxa" w:w="60"/>
+              <w:bottom w:type="dxa" w:w="25"/>
+              <w:right w:type="dxa" w:w="60"/>
+            </w:tcMar>
+          </w:tcPr>
+          <w:p>
+            <w:pPr>
+              <w:spacing w:after="0" w:line="220"/>
+            </w:pPr>
+            <w:r>
+              <w:rPr>
+                <w:rFonts w:ascii="Arial" w:cs="Arial" w:eastAsia="Arial" w:hAnsi="Arial"/>
+                <w:b/>
+                <w:bCs/>
+                <w:color w:val="FFFFFF"/>
+                <w:sz w:val="16"/>
+                <w:szCs w:val="16"/>
+              </w:rPr>
+              <w:t xml:space="preserve">Tratamiento en el modelo</w:t>
+            </w:r>
+          </w:p>
+        </w:tc>
+        <w:tc>
+          <w:tcPr>
+            <w:tcW w:type="dxa" w:w="3612"/>
+            <w:tcBorders>
+              <w:top w:val="single" w:color="BFBFBF" w:sz="4"/>
+              <w:left w:val="single" w:color="BFBFBF" w:sz="4"/>
+              <w:bottom w:val="single" w:color="BFBFBF" w:sz="4"/>
+              <w:right w:val="single" w:color="BFBFBF" w:sz="4"/>
+            </w:tcBorders>
+            <w:shd w:fill="1F3A5F" w:val="clear"/>
+            <w:tcMar>
+              <w:top w:type="dxa" w:w="25"/>
+              <w:left w:type="dxa" w:w="60"/>
+              <w:bottom w:type="dxa" w:w="25"/>
+              <w:right w:type="dxa" w:w="60"/>
+            </w:tcMar>
+          </w:tcPr>
+          <w:p>
+            <w:pPr>
+              <w:spacing w:after="0" w:line="220"/>
+            </w:pPr>
+            <w:r>
+              <w:rPr>
+                <w:rFonts w:ascii="Arial" w:cs="Arial" w:eastAsia="Arial" w:hAnsi="Arial"/>
+                <w:b/>
+                <w:bCs/>
+                <w:color w:val="FFFFFF"/>
+                <w:sz w:val="16"/>
+                <w:szCs w:val="16"/>
+              </w:rPr>
+              <w:t xml:space="preserve">Efecto económico</w:t>
+            </w:r>
+          </w:p>
+        </w:tc>
+      </w:tr>
+      <w:tr>
+        <w:trPr>
+          <w:cantSplit/>
+          <w:tblHeader w:val="off"/>
+        </w:trPr>
+        <w:tc>
+          <w:tcPr>
+            <w:tcW w:type="dxa" w:w="2100"/>
+            <w:tcBorders>
+              <w:top w:val="single" w:color="BFBFBF" w:sz="4"/>
+              <w:left w:val="single" w:color="BFBFBF" w:sz="4"/>
+              <w:bottom w:val="single" w:color="BFBFBF" w:sz="4"/>
+              <w:right w:val="single" w:color="BFBFBF" w:sz="4"/>
+            </w:tcBorders>
+            <w:tcMar>
+              <w:top w:type="dxa" w:w="25"/>
+              <w:left w:type="dxa" w:w="60"/>
+              <w:bottom w:type="dxa" w:w="25"/>
+              <w:right w:type="dxa" w:w="60"/>
+            </w:tcMar>
+          </w:tcPr>
+          <w:p>
+            <w:pPr>
+              <w:spacing w:after="0" w:line="220"/>
+            </w:pPr>
+            <w:r>
+              <w:rPr>
+                <w:rFonts w:ascii="Arial" w:cs="Arial" w:eastAsia="Arial" w:hAnsi="Arial"/>
+                <w:b w:val="false"/>
+                <w:bCs w:val="false"/>
+                <w:sz w:val="16"/>
+                <w:szCs w:val="16"/>
+              </w:rPr>
+              <w:t xml:space="preserve">APTO PARA SERVICIO (Nivel 1, 2 o 3; FAD pasa)</w:t>
+            </w:r>
+          </w:p>
+        </w:tc>
+        <w:tc>
+          <w:tcPr>
+            <w:tcW w:type="dxa" w:w="4700"/>
+            <w:tcBorders>
+              <w:top w:val="single" w:color="BFBFBF" w:sz="4"/>
+              <w:left w:val="single" w:color="BFBFBF" w:sz="4"/>
+              <w:bottom w:val="single" w:color="BFBFBF" w:sz="4"/>
+              <w:right w:val="single" w:color="BFBFBF" w:sz="4"/>
+            </w:tcBorders>
+            <w:tcMar>
+              <w:top w:type="dxa" w:w="25"/>
+              <w:left w:type="dxa" w:w="60"/>
+              <w:bottom w:type="dxa" w:w="25"/>
+              <w:right w:type="dxa" w:w="60"/>
+            </w:tcMar>
+          </w:tcPr>
+          <w:p>
+            <w:pPr>
+              <w:spacing w:after="0" w:line="220"/>
+            </w:pPr>
+            <w:r>
+              <w:rPr>
+                <w:rFonts w:ascii="Arial" w:cs="Arial" w:eastAsia="Arial" w:hAnsi="Arial"/>
+                <w:b w:val="false"/>
+                <w:bCs w:val="false"/>
+                <w:sz w:val="16"/>
+                <w:szCs w:val="16"/>
+              </w:rPr>
+              <w:t xml:space="preserve">DF_post = DF·conf·0,05 [MODELO]; nueva POF y categoría RAM</w:t>
+            </w:r>
+          </w:p>
+        </w:tc>
+        <w:tc>
+          <w:tcPr>
+            <w:tcW w:type="dxa" w:w="3612"/>
+            <w:tcBorders>
+              <w:top w:val="single" w:color="BFBFBF" w:sz="4"/>
+              <w:left w:val="single" w:color="BFBFBF" w:sz="4"/>
+              <w:bottom w:val="single" w:color="BFBFBF" w:sz="4"/>
+              <w:right w:val="single" w:color="BFBFBF" w:sz="4"/>
+            </w:tcBorders>
+            <w:tcMar>
+              <w:top w:type="dxa" w:w="25"/>
+              <w:left w:type="dxa" w:w="60"/>
+              <w:bottom w:type="dxa" w:w="25"/>
+              <w:right w:type="dxa" w:w="60"/>
+            </w:tcMar>
+          </w:tcPr>
+          <w:p>
+            <w:pPr>
+              <w:spacing w:after="0" w:line="220"/>
+            </w:pPr>
+            <w:r>
+              <w:rPr>
+                <w:rFonts w:ascii="Arial" w:cs="Arial" w:eastAsia="Arial" w:hAnsi="Arial"/>
+                <w:b w:val="false"/>
+                <w:bCs w:val="false"/>
+                <w:sz w:val="16"/>
+                <w:szCs w:val="16"/>
+              </w:rPr>
+              <w:t xml:space="preserve">RR (Ec. 9); costo de FFS en I0 (nivel 1/2/3: 3.000/15.000/60.000 USD, supuesto)</w:t>
+            </w:r>
+          </w:p>
+        </w:tc>
+      </w:tr>
+      <w:tr>
+        <w:trPr>
+          <w:cantSplit/>
+          <w:tblHeader w:val="off"/>
+        </w:trPr>
+        <w:tc>
+          <w:tcPr>
+            <w:tcW w:type="dxa" w:w="2100"/>
+            <w:tcBorders>
+              <w:top w:val="single" w:color="BFBFBF" w:sz="4"/>
+              <w:left w:val="single" w:color="BFBFBF" w:sz="4"/>
+              <w:bottom w:val="single" w:color="BFBFBF" w:sz="4"/>
+              <w:right w:val="single" w:color="BFBFBF" w:sz="4"/>
+            </w:tcBorders>
+            <w:shd w:fill="F6F8FB" w:val="clear"/>
+            <w:tcMar>
+              <w:top w:type="dxa" w:w="25"/>
+              <w:left w:type="dxa" w:w="60"/>
+              <w:bottom w:type="dxa" w:w="25"/>
+              <w:right w:type="dxa" w:w="60"/>
+            </w:tcMar>
+          </w:tcPr>
+          <w:p>
+            <w:pPr>
+              <w:spacing w:after="0" w:line="220"/>
+            </w:pPr>
+            <w:r>
+              <w:rPr>
+                <w:rFonts w:ascii="Arial" w:cs="Arial" w:eastAsia="Arial" w:hAnsi="Arial"/>
+                <w:b w:val="false"/>
+                <w:bCs w:val="false"/>
+                <w:sz w:val="16"/>
+                <w:szCs w:val="16"/>
+              </w:rPr>
+              <w:t xml:space="preserve">APTO CON LIMITACIONES (FAD pasa)</w:t>
+            </w:r>
+          </w:p>
+        </w:tc>
+        <w:tc>
+          <w:tcPr>
+            <w:tcW w:type="dxa" w:w="4700"/>
+            <w:tcBorders>
+              <w:top w:val="single" w:color="BFBFBF" w:sz="4"/>
+              <w:left w:val="single" w:color="BFBFBF" w:sz="4"/>
+              <w:bottom w:val="single" w:color="BFBFBF" w:sz="4"/>
+              <w:right w:val="single" w:color="BFBFBF" w:sz="4"/>
+            </w:tcBorders>
+            <w:shd w:fill="F6F8FB" w:val="clear"/>
+            <w:tcMar>
+              <w:top w:type="dxa" w:w="25"/>
+              <w:left w:type="dxa" w:w="60"/>
+              <w:bottom w:type="dxa" w:w="25"/>
+              <w:right w:type="dxa" w:w="60"/>
+            </w:tcMar>
+          </w:tcPr>
+          <w:p>
+            <w:pPr>
+              <w:spacing w:after="0" w:line="220"/>
+            </w:pPr>
+            <w:r>
+              <w:rPr>
+                <w:rFonts w:ascii="Arial" w:cs="Arial" w:eastAsia="Arial" w:hAnsi="Arial"/>
+                <w:b w:val="false"/>
+                <w:bCs w:val="false"/>
+                <w:sz w:val="16"/>
+                <w:szCs w:val="16"/>
+              </w:rPr>
+              <w:t xml:space="preserve">Crédito parcial f = 0,30 [SUPUESTO]; RUL fija el próximo intervalo</w:t>
+            </w:r>
+          </w:p>
+        </w:tc>
+        <w:tc>
+          <w:tcPr>
+            <w:tcW w:type="dxa" w:w="3612"/>
+            <w:tcBorders>
+              <w:top w:val="single" w:color="BFBFBF" w:sz="4"/>
+              <w:left w:val="single" w:color="BFBFBF" w:sz="4"/>
+              <w:bottom w:val="single" w:color="BFBFBF" w:sz="4"/>
+              <w:right w:val="single" w:color="BFBFBF" w:sz="4"/>
+            </w:tcBorders>
+            <w:shd w:fill="F6F8FB" w:val="clear"/>
+            <w:tcMar>
+              <w:top w:type="dxa" w:w="25"/>
+              <w:left w:type="dxa" w:w="60"/>
+              <w:bottom w:type="dxa" w:w="25"/>
+              <w:right w:type="dxa" w:w="60"/>
+            </w:tcMar>
+          </w:tcPr>
+          <w:p>
+            <w:pPr>
+              <w:spacing w:after="0" w:line="220"/>
+            </w:pPr>
+            <w:r>
+              <w:rPr>
+                <w:rFonts w:ascii="Arial" w:cs="Arial" w:eastAsia="Arial" w:hAnsi="Arial"/>
+                <w:b w:val="false"/>
+                <w:bCs w:val="false"/>
+                <w:sz w:val="16"/>
+                <w:szCs w:val="16"/>
+              </w:rPr>
+              <w:t xml:space="preserve">Costo de limitación (bajar P/T, monitoreo, reinspección) en I0; RR menor</w:t>
+            </w:r>
+          </w:p>
+        </w:tc>
+      </w:tr>
+      <w:tr>
+        <w:trPr>
+          <w:cantSplit/>
+          <w:tblHeader w:val="off"/>
+        </w:trPr>
+        <w:tc>
+          <w:tcPr>
+            <w:tcW w:type="dxa" w:w="2100"/>
+            <w:tcBorders>
+              <w:top w:val="single" w:color="BFBFBF" w:sz="4"/>
+              <w:left w:val="single" w:color="BFBFBF" w:sz="4"/>
+              <w:bottom w:val="single" w:color="BFBFBF" w:sz="4"/>
+              <w:right w:val="single" w:color="BFBFBF" w:sz="4"/>
+            </w:tcBorders>
+            <w:tcMar>
+              <w:top w:type="dxa" w:w="25"/>
+              <w:left w:type="dxa" w:w="60"/>
+              <w:bottom w:type="dxa" w:w="25"/>
+              <w:right w:type="dxa" w:w="60"/>
+            </w:tcMar>
+          </w:tcPr>
+          <w:p>
+            <w:pPr>
+              <w:spacing w:after="0" w:line="220"/>
+            </w:pPr>
+            <w:r>
+              <w:rPr>
+                <w:rFonts w:ascii="Arial" w:cs="Arial" w:eastAsia="Arial" w:hAnsi="Arial"/>
+                <w:b w:val="false"/>
+                <w:bCs w:val="false"/>
+                <w:sz w:val="16"/>
+                <w:szCs w:val="16"/>
+              </w:rPr>
+              <w:t xml:space="preserve">NO APTO (FAD no pasa)</w:t>
+            </w:r>
+          </w:p>
+        </w:tc>
+        <w:tc>
+          <w:tcPr>
+            <w:tcW w:type="dxa" w:w="4700"/>
+            <w:tcBorders>
+              <w:top w:val="single" w:color="BFBFBF" w:sz="4"/>
+              <w:left w:val="single" w:color="BFBFBF" w:sz="4"/>
+              <w:bottom w:val="single" w:color="BFBFBF" w:sz="4"/>
+              <w:right w:val="single" w:color="BFBFBF" w:sz="4"/>
+            </w:tcBorders>
+            <w:tcMar>
+              <w:top w:type="dxa" w:w="25"/>
+              <w:left w:type="dxa" w:w="60"/>
+              <w:bottom w:type="dxa" w:w="25"/>
+              <w:right w:type="dxa" w:w="60"/>
+            </w:tcMar>
+          </w:tcPr>
+          <w:p>
+            <w:pPr>
+              <w:spacing w:after="0" w:line="220"/>
+            </w:pPr>
+            <w:r>
+              <w:rPr>
+                <w:rFonts w:ascii="Arial" w:cs="Arial" w:eastAsia="Arial" w:hAnsi="Arial"/>
+                <w:b w:val="false"/>
+                <w:bCs w:val="false"/>
+                <w:sz w:val="16"/>
+                <w:szCs w:val="16"/>
+              </w:rPr>
+              <w:t xml:space="preserve">Reparar, reemplazar o rebajar; tras reparar DF = 1</w:t>
+            </w:r>
+          </w:p>
+        </w:tc>
+        <w:tc>
+          <w:tcPr>
+            <w:tcW w:type="dxa" w:w="3612"/>
+            <w:tcBorders>
+              <w:top w:val="single" w:color="BFBFBF" w:sz="4"/>
+              <w:left w:val="single" w:color="BFBFBF" w:sz="4"/>
+              <w:bottom w:val="single" w:color="BFBFBF" w:sz="4"/>
+              <w:right w:val="single" w:color="BFBFBF" w:sz="4"/>
+            </w:tcBorders>
+            <w:tcMar>
+              <w:top w:type="dxa" w:w="25"/>
+              <w:left w:type="dxa" w:w="60"/>
+              <w:bottom w:type="dxa" w:w="25"/>
+              <w:right w:type="dxa" w:w="60"/>
+            </w:tcMar>
+          </w:tcPr>
+          <w:p>
+            <w:pPr>
+              <w:spacing w:after="0" w:line="220"/>
+            </w:pPr>
+            <w:r>
+              <w:rPr>
+                <w:rFonts w:ascii="Arial" w:cs="Arial" w:eastAsia="Arial" w:hAnsi="Arial"/>
+                <w:b w:val="false"/>
+                <w:bCs w:val="false"/>
+                <w:sz w:val="16"/>
+                <w:szCs w:val="16"/>
+              </w:rPr>
+              <w:t xml:space="preserve">Costo de reparación/reemplazo en I0; el riesgo previo persiste hasta reparar</w:t>
+            </w:r>
+          </w:p>
+        </w:tc>
+      </w:tr>
+      <w:tr>
+        <w:trPr>
+          <w:cantSplit/>
+          <w:tblHeader w:val="off"/>
+        </w:trPr>
+        <w:tc>
+          <w:tcPr>
+            <w:tcW w:type="dxa" w:w="2100"/>
+            <w:tcBorders>
+              <w:top w:val="single" w:color="BFBFBF" w:sz="4"/>
+              <w:left w:val="single" w:color="BFBFBF" w:sz="4"/>
+              <w:bottom w:val="single" w:color="BFBFBF" w:sz="4"/>
+              <w:right w:val="single" w:color="BFBFBF" w:sz="4"/>
+            </w:tcBorders>
+            <w:shd w:fill="F6F8FB" w:val="clear"/>
+            <w:tcMar>
+              <w:top w:type="dxa" w:w="25"/>
+              <w:left w:type="dxa" w:w="60"/>
+              <w:bottom w:type="dxa" w:w="25"/>
+              <w:right w:type="dxa" w:w="60"/>
+            </w:tcMar>
+          </w:tcPr>
+          <w:p>
+            <w:pPr>
+              <w:spacing w:after="0" w:line="220"/>
+            </w:pPr>
+            <w:r>
+              <w:rPr>
+                <w:rFonts w:ascii="Arial" w:cs="Arial" w:eastAsia="Arial" w:hAnsi="Arial"/>
+                <w:b w:val="false"/>
+                <w:bCs w:val="false"/>
+                <w:sz w:val="16"/>
+                <w:szCs w:val="16"/>
+              </w:rPr>
+              <w:t xml:space="preserve">Inconsistente (Apto con FAD No pasa)</w:t>
+            </w:r>
+          </w:p>
+        </w:tc>
+        <w:tc>
+          <w:tcPr>
+            <w:tcW w:type="dxa" w:w="4700"/>
+            <w:tcBorders>
+              <w:top w:val="single" w:color="BFBFBF" w:sz="4"/>
+              <w:left w:val="single" w:color="BFBFBF" w:sz="4"/>
+              <w:bottom w:val="single" w:color="BFBFBF" w:sz="4"/>
+              <w:right w:val="single" w:color="BFBFBF" w:sz="4"/>
+            </w:tcBorders>
+            <w:shd w:fill="F6F8FB" w:val="clear"/>
+            <w:tcMar>
+              <w:top w:type="dxa" w:w="25"/>
+              <w:left w:type="dxa" w:w="60"/>
+              <w:bottom w:type="dxa" w:w="25"/>
+              <w:right w:type="dxa" w:w="60"/>
+            </w:tcMar>
+          </w:tcPr>
+          <w:p>
+            <w:pPr>
+              <w:spacing w:after="0" w:line="220"/>
+            </w:pPr>
+            <w:r>
+              <w:rPr>
+                <w:rFonts w:ascii="Arial" w:cs="Arial" w:eastAsia="Arial" w:hAnsi="Arial"/>
+                <w:b w:val="false"/>
+                <w:bCs w:val="false"/>
+                <w:sz w:val="16"/>
+                <w:szCs w:val="16"/>
+              </w:rPr>
+              <w:t xml:space="preserve">"REVISAR": sin crédito de riesgo</w:t>
+            </w:r>
+          </w:p>
+        </w:tc>
+        <w:tc>
+          <w:tcPr>
+            <w:tcW w:type="dxa" w:w="3612"/>
+            <w:tcBorders>
+              <w:top w:val="single" w:color="BFBFBF" w:sz="4"/>
+              <w:left w:val="single" w:color="BFBFBF" w:sz="4"/>
+              <w:bottom w:val="single" w:color="BFBFBF" w:sz="4"/>
+              <w:right w:val="single" w:color="BFBFBF" w:sz="4"/>
+            </w:tcBorders>
+            <w:shd w:fill="F6F8FB" w:val="clear"/>
+            <w:tcMar>
+              <w:top w:type="dxa" w:w="25"/>
+              <w:left w:type="dxa" w:w="60"/>
+              <w:bottom w:type="dxa" w:w="25"/>
+              <w:right w:type="dxa" w:w="60"/>
+            </w:tcMar>
+          </w:tcPr>
+          <w:p>
+            <w:pPr>
+              <w:spacing w:after="0" w:line="220"/>
+            </w:pPr>
+            <w:r>
+              <w:rPr>
+                <w:rFonts w:ascii="Arial" w:cs="Arial" w:eastAsia="Arial" w:hAnsi="Arial"/>
+                <w:b w:val="false"/>
+                <w:bCs w:val="false"/>
+                <w:sz w:val="16"/>
+                <w:szCs w:val="16"/>
+              </w:rPr>
+              <w:t xml:space="preserve">Ninguno hasta resolver</w:t>
+            </w:r>
+          </w:p>
+        </w:tc>
+      </w:tr>
+    </w:tbl>
+    <w:p>
+      <w:pPr>
+        <w:spacing w:after="30" w:before="30" w:line="250"/>
+      </w:pPr>
+      <w:r>
+        <w:rPr>
+          <w:rFonts w:ascii="Arial" w:cs="Arial" w:eastAsia="Arial" w:hAnsi="Arial"/>
+          <w:b/>
+          <w:bCs/>
+          <w:sz w:val="19"/>
+          <w:szCs w:val="19"/>
+        </w:rPr>
+        <w:t xml:space="preserve">Niveles:</w:t>
+      </w:r>
+      <w:r>
+        <w:rPr>
+          <w:rFonts w:ascii="Arial" w:cs="Arial" w:eastAsia="Arial" w:hAnsi="Arial"/>
+          <w:sz w:val="19"/>
+          <w:szCs w:val="19"/>
+        </w:rPr>
+        <w:t xml:space="preserve"> 1 = cribado con criterios simples; 2 = evaluación detallada con cálculo; 3 = análisis avanzado (elementos finitos, mecánica de fractura, probabilístico). Se escala de nivel solo si el anterior no concluye. </w:t>
+      </w:r>
+      <w:r>
+        <w:rPr>
+          <w:rFonts w:ascii="Arial" w:cs="Arial" w:eastAsia="Arial" w:hAnsi="Arial"/>
+          <w:b/>
+          <w:bCs/>
+          <w:sz w:val="19"/>
+          <w:szCs w:val="19"/>
+        </w:rPr>
+        <w:t xml:space="preserve">RUL</w:t>
+      </w:r>
+      <w:r>
+        <w:rPr>
+          <w:rFonts w:ascii="Arial" w:cs="Arial" w:eastAsia="Arial" w:hAnsi="Arial"/>
+          <w:sz w:val="19"/>
+          <w:szCs w:val="19"/>
+        </w:rPr>
+        <w:t xml:space="preserve"> = (t − t_mín)/CR − edad (años). </w:t>
+      </w:r>
+      <w:r>
+        <w:rPr>
+          <w:rFonts w:ascii="Arial" w:cs="Arial" w:eastAsia="Arial" w:hAnsi="Arial"/>
+          <w:b/>
+          <w:bCs/>
+          <w:sz w:val="19"/>
+          <w:szCs w:val="19"/>
+        </w:rPr>
+        <w:t xml:space="preserve">Extensión de vida</w:t>
+      </w:r>
+      <w:r>
+        <w:rPr>
+          <w:rFonts w:ascii="Arial" w:cs="Arial" w:eastAsia="Arial" w:hAnsi="Arial"/>
+          <w:sz w:val="19"/>
+          <w:szCs w:val="19"/>
+        </w:rPr>
+        <w:t xml:space="preserve"> (propuesta, no implementada en la hoja): valor del reemplazo diferido = C_reemplazo·[1 − (1+r)^−ΔRUL].</w:t>
+      </w:r>
+    </w:p>
+    <w:tbl>
+      <w:tblPr>
+        <w:tblW w:type="dxa" w:w="10412"/>
+        <w:tblBorders>
+          <w:top w:val="single" w:color="auto" w:sz="4"/>
+          <w:left w:val="single" w:color="auto" w:sz="4"/>
+          <w:bottom w:val="single" w:color="auto" w:sz="4"/>
+          <w:right w:val="single" w:color="auto" w:sz="4"/>
+          <w:insideH w:val="single" w:color="auto" w:sz="4"/>
+          <w:insideV w:val="single" w:color="auto" w:sz="4"/>
+        </w:tblBorders>
+      </w:tblPr>
+      <w:tblGrid>
+        <w:gridCol w:w="2100"/>
+        <w:gridCol w:w="4700"/>
+        <w:gridCol w:w="3612"/>
+      </w:tblGrid>
+      <w:tr>
+        <w:trPr>
+          <w:cantSplit/>
+          <w:tblHeader/>
+        </w:trPr>
+        <w:tc>
+          <w:tcPr>
+            <w:tcW w:type="dxa" w:w="2100"/>
+            <w:tcBorders>
+              <w:top w:val="single" w:color="BFBFBF" w:sz="4"/>
+              <w:left w:val="single" w:color="BFBFBF" w:sz="4"/>
+              <w:bottom w:val="single" w:color="BFBFBF" w:sz="4"/>
+              <w:right w:val="single" w:color="BFBFBF" w:sz="4"/>
+            </w:tcBorders>
+            <w:shd w:fill="1F3A5F" w:val="clear"/>
+            <w:tcMar>
+              <w:top w:type="dxa" w:w="25"/>
+              <w:left w:type="dxa" w:w="60"/>
+              <w:bottom w:type="dxa" w:w="25"/>
+              <w:right w:type="dxa" w:w="60"/>
+            </w:tcMar>
+          </w:tcPr>
+          <w:p>
+            <w:pPr>
+              <w:spacing w:after="0" w:line="220"/>
+            </w:pPr>
+            <w:r>
+              <w:rPr>
+                <w:rFonts w:ascii="Arial" w:cs="Arial" w:eastAsia="Arial" w:hAnsi="Arial"/>
+                <w:b/>
+                <w:bCs/>
+                <w:color w:val="FFFFFF"/>
+                <w:sz w:val="16"/>
+                <w:szCs w:val="16"/>
+              </w:rPr>
+              <w:t xml:space="preserve">Mecanismo</w:t>
+            </w:r>
+          </w:p>
+        </w:tc>
+        <w:tc>
+          <w:tcPr>
+            <w:tcW w:type="dxa" w:w="4700"/>
+            <w:tcBorders>
+              <w:top w:val="single" w:color="BFBFBF" w:sz="4"/>
+              <w:left w:val="single" w:color="BFBFBF" w:sz="4"/>
+              <w:bottom w:val="single" w:color="BFBFBF" w:sz="4"/>
+              <w:right w:val="single" w:color="BFBFBF" w:sz="4"/>
+            </w:tcBorders>
+            <w:shd w:fill="1F3A5F" w:val="clear"/>
+            <w:tcMar>
+              <w:top w:type="dxa" w:w="25"/>
+              <w:left w:type="dxa" w:w="60"/>
+              <w:bottom w:type="dxa" w:w="25"/>
+              <w:right w:type="dxa" w:w="60"/>
+            </w:tcMar>
+          </w:tcPr>
+          <w:p>
+            <w:pPr>
+              <w:spacing w:after="0" w:line="220"/>
+            </w:pPr>
+            <w:r>
+              <w:rPr>
+                <w:rFonts w:ascii="Arial" w:cs="Arial" w:eastAsia="Arial" w:hAnsi="Arial"/>
+                <w:b/>
+                <w:bCs/>
+                <w:color w:val="FFFFFF"/>
+                <w:sz w:val="16"/>
+                <w:szCs w:val="16"/>
+              </w:rPr>
+              <w:t xml:space="preserve">Técnicas NDE candidatas (criterio de ingeniería; verificar efectividad A–E en API 581 y PCC-3)</w:t>
+            </w:r>
+          </w:p>
+        </w:tc>
+        <w:tc>
+          <w:tcPr>
+            <w:tcW w:type="dxa" w:w="3612"/>
+            <w:tcBorders>
+              <w:top w:val="single" w:color="BFBFBF" w:sz="4"/>
+              <w:left w:val="single" w:color="BFBFBF" w:sz="4"/>
+              <w:bottom w:val="single" w:color="BFBFBF" w:sz="4"/>
+              <w:right w:val="single" w:color="BFBFBF" w:sz="4"/>
+            </w:tcBorders>
+            <w:shd w:fill="1F3A5F" w:val="clear"/>
+            <w:tcMar>
+              <w:top w:type="dxa" w:w="25"/>
+              <w:left w:type="dxa" w:w="60"/>
+              <w:bottom w:type="dxa" w:w="25"/>
+              <w:right w:type="dxa" w:w="60"/>
+            </w:tcMar>
+          </w:tcPr>
+          <w:p>
+            <w:pPr>
+              <w:spacing w:after="0" w:line="220"/>
+            </w:pPr>
+            <w:r>
+              <w:rPr>
+                <w:rFonts w:ascii="Arial" w:cs="Arial" w:eastAsia="Arial" w:hAnsi="Arial"/>
+                <w:b/>
+                <w:bCs/>
+                <w:color w:val="FFFFFF"/>
+                <w:sz w:val="16"/>
+                <w:szCs w:val="16"/>
+              </w:rPr>
+              <w:t xml:space="preserve">Opción no intrusiva</w:t>
+            </w:r>
+          </w:p>
+        </w:tc>
+      </w:tr>
+      <w:tr>
+        <w:trPr>
+          <w:cantSplit/>
+          <w:tblHeader w:val="off"/>
+        </w:trPr>
+        <w:tc>
+          <w:tcPr>
+            <w:tcW w:type="dxa" w:w="2100"/>
+            <w:tcBorders>
+              <w:top w:val="single" w:color="BFBFBF" w:sz="4"/>
+              <w:left w:val="single" w:color="BFBFBF" w:sz="4"/>
+              <w:bottom w:val="single" w:color="BFBFBF" w:sz="4"/>
+              <w:right w:val="single" w:color="BFBFBF" w:sz="4"/>
+            </w:tcBorders>
+            <w:tcMar>
+              <w:top w:type="dxa" w:w="25"/>
+              <w:left w:type="dxa" w:w="60"/>
+              <w:bottom w:type="dxa" w:w="25"/>
+              <w:right w:type="dxa" w:w="60"/>
+            </w:tcMar>
+          </w:tcPr>
+          <w:p>
+            <w:pPr>
+              <w:spacing w:after="0" w:line="220"/>
+            </w:pPr>
+            <w:r>
+              <w:rPr>
+                <w:rFonts w:ascii="Arial" w:cs="Arial" w:eastAsia="Arial" w:hAnsi="Arial"/>
+                <w:b w:val="false"/>
+                <w:bCs w:val="false"/>
+                <w:sz w:val="16"/>
+                <w:szCs w:val="16"/>
+              </w:rPr>
+              <w:t xml:space="preserve">Adelgazamiento, sulfidación, nafténica</w:t>
+            </w:r>
+          </w:p>
+        </w:tc>
+        <w:tc>
+          <w:tcPr>
+            <w:tcW w:type="dxa" w:w="4700"/>
+            <w:tcBorders>
+              <w:top w:val="single" w:color="BFBFBF" w:sz="4"/>
+              <w:left w:val="single" w:color="BFBFBF" w:sz="4"/>
+              <w:bottom w:val="single" w:color="BFBFBF" w:sz="4"/>
+              <w:right w:val="single" w:color="BFBFBF" w:sz="4"/>
+            </w:tcBorders>
+            <w:tcMar>
+              <w:top w:type="dxa" w:w="25"/>
+              <w:left w:type="dxa" w:w="60"/>
+              <w:bottom w:type="dxa" w:w="25"/>
+              <w:right w:type="dxa" w:w="60"/>
+            </w:tcMar>
+          </w:tcPr>
+          <w:p>
+            <w:pPr>
+              <w:spacing w:after="0" w:line="220"/>
+            </w:pPr>
+            <w:r>
+              <w:rPr>
+                <w:rFonts w:ascii="Arial" w:cs="Arial" w:eastAsia="Arial" w:hAnsi="Arial"/>
+                <w:b w:val="false"/>
+                <w:bCs w:val="false"/>
+                <w:sz w:val="16"/>
+                <w:szCs w:val="16"/>
+              </w:rPr>
+              <w:t xml:space="preserve">Mapeo/escaneo UT de espesores, radiografía de perfil, puntos UT (TML)</w:t>
+            </w:r>
+          </w:p>
+        </w:tc>
+        <w:tc>
+          <w:tcPr>
+            <w:tcW w:type="dxa" w:w="3612"/>
+            <w:tcBorders>
+              <w:top w:val="single" w:color="BFBFBF" w:sz="4"/>
+              <w:left w:val="single" w:color="BFBFBF" w:sz="4"/>
+              <w:bottom w:val="single" w:color="BFBFBF" w:sz="4"/>
+              <w:right w:val="single" w:color="BFBFBF" w:sz="4"/>
+            </w:tcBorders>
+            <w:tcMar>
+              <w:top w:type="dxa" w:w="25"/>
+              <w:left w:type="dxa" w:w="60"/>
+              <w:bottom w:type="dxa" w:w="25"/>
+              <w:right w:type="dxa" w:w="60"/>
+            </w:tcMar>
+          </w:tcPr>
+          <w:p>
+            <w:pPr>
+              <w:spacing w:after="0" w:line="220"/>
+            </w:pPr>
+            <w:r>
+              <w:rPr>
+                <w:rFonts w:ascii="Arial" w:cs="Arial" w:eastAsia="Arial" w:hAnsi="Arial"/>
+                <w:b w:val="false"/>
+                <w:bCs w:val="false"/>
+                <w:sz w:val="16"/>
+                <w:szCs w:val="16"/>
+              </w:rPr>
+              <w:t xml:space="preserve">Sí: UT y radiografía de perfil desde el exterior [P §2.3]</w:t>
+            </w:r>
+          </w:p>
+        </w:tc>
+      </w:tr>
+      <w:tr>
+        <w:trPr>
+          <w:cantSplit/>
+          <w:tblHeader w:val="off"/>
+        </w:trPr>
+        <w:tc>
+          <w:tcPr>
+            <w:tcW w:type="dxa" w:w="2100"/>
+            <w:tcBorders>
+              <w:top w:val="single" w:color="BFBFBF" w:sz="4"/>
+              <w:left w:val="single" w:color="BFBFBF" w:sz="4"/>
+              <w:bottom w:val="single" w:color="BFBFBF" w:sz="4"/>
+              <w:right w:val="single" w:color="BFBFBF" w:sz="4"/>
+            </w:tcBorders>
+            <w:shd w:fill="F6F8FB" w:val="clear"/>
+            <w:tcMar>
+              <w:top w:type="dxa" w:w="25"/>
+              <w:left w:type="dxa" w:w="60"/>
+              <w:bottom w:type="dxa" w:w="25"/>
+              <w:right w:type="dxa" w:w="60"/>
+            </w:tcMar>
+          </w:tcPr>
+          <w:p>
+            <w:pPr>
+              <w:spacing w:after="0" w:line="220"/>
+            </w:pPr>
+            <w:r>
+              <w:rPr>
+                <w:rFonts w:ascii="Arial" w:cs="Arial" w:eastAsia="Arial" w:hAnsi="Arial"/>
+                <w:b w:val="false"/>
+                <w:bCs w:val="false"/>
+                <w:sz w:val="16"/>
+                <w:szCs w:val="16"/>
+              </w:rPr>
+              <w:t xml:space="preserve">CUI y corrosión externa</w:t>
+            </w:r>
+          </w:p>
+        </w:tc>
+        <w:tc>
+          <w:tcPr>
+            <w:tcW w:type="dxa" w:w="4700"/>
+            <w:tcBorders>
+              <w:top w:val="single" w:color="BFBFBF" w:sz="4"/>
+              <w:left w:val="single" w:color="BFBFBF" w:sz="4"/>
+              <w:bottom w:val="single" w:color="BFBFBF" w:sz="4"/>
+              <w:right w:val="single" w:color="BFBFBF" w:sz="4"/>
+            </w:tcBorders>
+            <w:shd w:fill="F6F8FB" w:val="clear"/>
+            <w:tcMar>
+              <w:top w:type="dxa" w:w="25"/>
+              <w:left w:type="dxa" w:w="60"/>
+              <w:bottom w:type="dxa" w:w="25"/>
+              <w:right w:type="dxa" w:w="60"/>
+            </w:tcMar>
+          </w:tcPr>
+          <w:p>
+            <w:pPr>
+              <w:spacing w:after="0" w:line="220"/>
+            </w:pPr>
+            <w:r>
+              <w:rPr>
+                <w:rFonts w:ascii="Arial" w:cs="Arial" w:eastAsia="Arial" w:hAnsi="Arial"/>
+                <w:b w:val="false"/>
+                <w:bCs w:val="false"/>
+                <w:sz w:val="16"/>
+                <w:szCs w:val="16"/>
+              </w:rPr>
+              <w:t xml:space="preserve">Radiografía de perfil, corrientes de Foucault pulsadas, retiro parcial de aislamiento con inspección visual</w:t>
+            </w:r>
+          </w:p>
+        </w:tc>
+        <w:tc>
+          <w:tcPr>
+            <w:tcW w:type="dxa" w:w="3612"/>
+            <w:tcBorders>
+              <w:top w:val="single" w:color="BFBFBF" w:sz="4"/>
+              <w:left w:val="single" w:color="BFBFBF" w:sz="4"/>
+              <w:bottom w:val="single" w:color="BFBFBF" w:sz="4"/>
+              <w:right w:val="single" w:color="BFBFBF" w:sz="4"/>
+            </w:tcBorders>
+            <w:shd w:fill="F6F8FB" w:val="clear"/>
+            <w:tcMar>
+              <w:top w:type="dxa" w:w="25"/>
+              <w:left w:type="dxa" w:w="60"/>
+              <w:bottom w:type="dxa" w:w="25"/>
+              <w:right w:type="dxa" w:w="60"/>
+            </w:tcMar>
+          </w:tcPr>
+          <w:p>
+            <w:pPr>
+              <w:spacing w:after="0" w:line="220"/>
+            </w:pPr>
+            <w:r>
+              <w:rPr>
+                <w:rFonts w:ascii="Arial" w:cs="Arial" w:eastAsia="Arial" w:hAnsi="Arial"/>
+                <w:b w:val="false"/>
+                <w:bCs w:val="false"/>
+                <w:sz w:val="16"/>
+                <w:szCs w:val="16"/>
+              </w:rPr>
+              <w:t xml:space="preserve">Sí, sin retirar aislamiento</w:t>
+            </w:r>
+          </w:p>
+        </w:tc>
+      </w:tr>
+      <w:tr>
+        <w:trPr>
+          <w:cantSplit/>
+          <w:tblHeader w:val="off"/>
+        </w:trPr>
+        <w:tc>
+          <w:tcPr>
+            <w:tcW w:type="dxa" w:w="2100"/>
+            <w:tcBorders>
+              <w:top w:val="single" w:color="BFBFBF" w:sz="4"/>
+              <w:left w:val="single" w:color="BFBFBF" w:sz="4"/>
+              <w:bottom w:val="single" w:color="BFBFBF" w:sz="4"/>
+              <w:right w:val="single" w:color="BFBFBF" w:sz="4"/>
+            </w:tcBorders>
+            <w:tcMar>
+              <w:top w:type="dxa" w:w="25"/>
+              <w:left w:type="dxa" w:w="60"/>
+              <w:bottom w:type="dxa" w:w="25"/>
+              <w:right w:type="dxa" w:w="60"/>
+            </w:tcMar>
+          </w:tcPr>
+          <w:p>
+            <w:pPr>
+              <w:spacing w:after="0" w:line="220"/>
+            </w:pPr>
+            <w:r>
+              <w:rPr>
+                <w:rFonts w:ascii="Arial" w:cs="Arial" w:eastAsia="Arial" w:hAnsi="Arial"/>
+                <w:b w:val="false"/>
+                <w:bCs w:val="false"/>
+                <w:sz w:val="16"/>
+                <w:szCs w:val="16"/>
+              </w:rPr>
+              <w:t xml:space="preserve">HIC/SOHIC, SCC</w:t>
+            </w:r>
+          </w:p>
+        </w:tc>
+        <w:tc>
+          <w:tcPr>
+            <w:tcW w:type="dxa" w:w="4700"/>
+            <w:tcBorders>
+              <w:top w:val="single" w:color="BFBFBF" w:sz="4"/>
+              <w:left w:val="single" w:color="BFBFBF" w:sz="4"/>
+              <w:bottom w:val="single" w:color="BFBFBF" w:sz="4"/>
+              <w:right w:val="single" w:color="BFBFBF" w:sz="4"/>
+            </w:tcBorders>
+            <w:tcMar>
+              <w:top w:type="dxa" w:w="25"/>
+              <w:left w:type="dxa" w:w="60"/>
+              <w:bottom w:type="dxa" w:w="25"/>
+              <w:right w:type="dxa" w:w="60"/>
+            </w:tcMar>
+          </w:tcPr>
+          <w:p>
+            <w:pPr>
+              <w:spacing w:after="0" w:line="220"/>
+            </w:pPr>
+            <w:r>
+              <w:rPr>
+                <w:rFonts w:ascii="Arial" w:cs="Arial" w:eastAsia="Arial" w:hAnsi="Arial"/>
+                <w:b w:val="false"/>
+                <w:bCs w:val="false"/>
+                <w:sz w:val="16"/>
+                <w:szCs w:val="16"/>
+              </w:rPr>
+              <w:t xml:space="preserve">UT de haz angular/phased array/TOFD, partículas magnéticas fluorescentes húmedas</w:t>
+            </w:r>
+          </w:p>
+        </w:tc>
+        <w:tc>
+          <w:tcPr>
+            <w:tcW w:type="dxa" w:w="3612"/>
+            <w:tcBorders>
+              <w:top w:val="single" w:color="BFBFBF" w:sz="4"/>
+              <w:left w:val="single" w:color="BFBFBF" w:sz="4"/>
+              <w:bottom w:val="single" w:color="BFBFBF" w:sz="4"/>
+              <w:right w:val="single" w:color="BFBFBF" w:sz="4"/>
+            </w:tcBorders>
+            <w:tcMar>
+              <w:top w:type="dxa" w:w="25"/>
+              <w:left w:type="dxa" w:w="60"/>
+              <w:bottom w:type="dxa" w:w="25"/>
+              <w:right w:type="dxa" w:w="60"/>
+            </w:tcMar>
+          </w:tcPr>
+          <w:p>
+            <w:pPr>
+              <w:spacing w:after="0" w:line="220"/>
+            </w:pPr>
+            <w:r>
+              <w:rPr>
+                <w:rFonts w:ascii="Arial" w:cs="Arial" w:eastAsia="Arial" w:hAnsi="Arial"/>
+                <w:b w:val="false"/>
+                <w:bCs w:val="false"/>
+                <w:sz w:val="16"/>
+                <w:szCs w:val="16"/>
+              </w:rPr>
+              <w:t xml:space="preserve">Parcial</w:t>
+            </w:r>
+          </w:p>
+        </w:tc>
+      </w:tr>
+      <w:tr>
+        <w:trPr>
+          <w:cantSplit/>
+          <w:tblHeader w:val="off"/>
+        </w:trPr>
+        <w:tc>
+          <w:tcPr>
+            <w:tcW w:type="dxa" w:w="2100"/>
+            <w:tcBorders>
+              <w:top w:val="single" w:color="BFBFBF" w:sz="4"/>
+              <w:left w:val="single" w:color="BFBFBF" w:sz="4"/>
+              <w:bottom w:val="single" w:color="BFBFBF" w:sz="4"/>
+              <w:right w:val="single" w:color="BFBFBF" w:sz="4"/>
+            </w:tcBorders>
+            <w:shd w:fill="F6F8FB" w:val="clear"/>
+            <w:tcMar>
+              <w:top w:type="dxa" w:w="25"/>
+              <w:left w:type="dxa" w:w="60"/>
+              <w:bottom w:type="dxa" w:w="25"/>
+              <w:right w:type="dxa" w:w="60"/>
+            </w:tcMar>
+          </w:tcPr>
+          <w:p>
+            <w:pPr>
+              <w:spacing w:after="0" w:line="220"/>
+            </w:pPr>
+            <w:r>
+              <w:rPr>
+                <w:rFonts w:ascii="Arial" w:cs="Arial" w:eastAsia="Arial" w:hAnsi="Arial"/>
+                <w:b w:val="false"/>
+                <w:bCs w:val="false"/>
+                <w:sz w:val="16"/>
+                <w:szCs w:val="16"/>
+              </w:rPr>
+              <w:t xml:space="preserve">HTHA</w:t>
+            </w:r>
+          </w:p>
+        </w:tc>
+        <w:tc>
+          <w:tcPr>
+            <w:tcW w:type="dxa" w:w="4700"/>
+            <w:tcBorders>
+              <w:top w:val="single" w:color="BFBFBF" w:sz="4"/>
+              <w:left w:val="single" w:color="BFBFBF" w:sz="4"/>
+              <w:bottom w:val="single" w:color="BFBFBF" w:sz="4"/>
+              <w:right w:val="single" w:color="BFBFBF" w:sz="4"/>
+            </w:tcBorders>
+            <w:shd w:fill="F6F8FB" w:val="clear"/>
+            <w:tcMar>
+              <w:top w:type="dxa" w:w="25"/>
+              <w:left w:type="dxa" w:w="60"/>
+              <w:bottom w:type="dxa" w:w="25"/>
+              <w:right w:type="dxa" w:w="60"/>
+            </w:tcMar>
+          </w:tcPr>
+          <w:p>
+            <w:pPr>
+              <w:spacing w:after="0" w:line="220"/>
+            </w:pPr>
+            <w:r>
+              <w:rPr>
+                <w:rFonts w:ascii="Arial" w:cs="Arial" w:eastAsia="Arial" w:hAnsi="Arial"/>
+                <w:b w:val="false"/>
+                <w:bCs w:val="false"/>
+                <w:sz w:val="16"/>
+                <w:szCs w:val="16"/>
+              </w:rPr>
+              <w:t xml:space="preserve">UT avanzado (backscatter, TOFD), réplicas metalográficas</w:t>
+            </w:r>
+          </w:p>
+        </w:tc>
+        <w:tc>
+          <w:tcPr>
+            <w:tcW w:type="dxa" w:w="3612"/>
+            <w:tcBorders>
+              <w:top w:val="single" w:color="BFBFBF" w:sz="4"/>
+              <w:left w:val="single" w:color="BFBFBF" w:sz="4"/>
+              <w:bottom w:val="single" w:color="BFBFBF" w:sz="4"/>
+              <w:right w:val="single" w:color="BFBFBF" w:sz="4"/>
+            </w:tcBorders>
+            <w:shd w:fill="F6F8FB" w:val="clear"/>
+            <w:tcMar>
+              <w:top w:type="dxa" w:w="25"/>
+              <w:left w:type="dxa" w:w="60"/>
+              <w:bottom w:type="dxa" w:w="25"/>
+              <w:right w:type="dxa" w:w="60"/>
+            </w:tcMar>
+          </w:tcPr>
+          <w:p>
+            <w:pPr>
+              <w:spacing w:after="0" w:line="220"/>
+            </w:pPr>
+            <w:r>
+              <w:rPr>
+                <w:rFonts w:ascii="Arial" w:cs="Arial" w:eastAsia="Arial" w:hAnsi="Arial"/>
+                <w:b w:val="false"/>
+                <w:bCs w:val="false"/>
+                <w:sz w:val="16"/>
+                <w:szCs w:val="16"/>
+              </w:rPr>
+              <w:t xml:space="preserve">Parcial</w:t>
+            </w:r>
+          </w:p>
+        </w:tc>
+      </w:tr>
+    </w:tbl>
+    <w:p>
+      <w:pPr>
+        <w:spacing w:after="30" w:before="30" w:line="250"/>
+      </w:pPr>
+      <w:r>
+        <w:rPr>
+          <w:rFonts w:ascii="Arial" w:cs="Arial" w:eastAsia="Arial" w:hAnsi="Arial"/>
+          <w:b/>
+          <w:bCs/>
+          <w:sz w:val="19"/>
+          <w:szCs w:val="19"/>
+        </w:rPr>
+        <w:t xml:space="preserve">Valor de una técnica NDE:</w:t>
+      </w:r>
+      <w:r>
+        <w:rPr>
+          <w:rFonts w:ascii="Arial" w:cs="Arial" w:eastAsia="Arial" w:hAnsi="Arial"/>
+          <w:sz w:val="19"/>
+          <w:szCs w:val="19"/>
+        </w:rPr>
+        <w:t xml:space="preserve"> VNE = (R₀ − R₁,ef) − (C_insp + L_parada)/T_RBI; se elige la de mayor VNE. </w:t>
+      </w:r>
+      <w:r>
+        <w:rPr>
+          <w:rFonts w:ascii="Arial" w:cs="Arial" w:eastAsia="Arial" w:hAnsi="Arial"/>
+          <w:b/>
+          <w:bCs/>
+          <w:sz w:val="19"/>
+          <w:szCs w:val="19"/>
+        </w:rPr>
+        <w:t xml:space="preserve">Dato del paper:</w:t>
+      </w:r>
+      <w:r>
+        <w:rPr>
+          <w:rFonts w:ascii="Arial" w:cs="Arial" w:eastAsia="Arial" w:hAnsi="Arial"/>
+          <w:sz w:val="19"/>
+          <w:szCs w:val="19"/>
+        </w:rPr>
+        <w:t xml:space="preserve"> inspección por adelgazamiento con efectividad A intrusiva cuesta 720 USD y para 12 h la unidad [P Tabla 4]; a 40.000 USD/día son 20.000 USD de producción, total 20.720 USD; la versión no intrusiva cuesta 1.440 USD sin parada [P Tabla 5], un ahorro de 19.280 USD por inspección.</w:t>
+      </w:r>
+    </w:p>
+    <w:tbl>
+      <w:tblPr>
+        <w:tblW w:type="dxa" w:w="10412"/>
+        <w:tblBorders>
+          <w:top w:val="single" w:color="auto" w:sz="4"/>
+          <w:left w:val="single" w:color="auto" w:sz="4"/>
+          <w:bottom w:val="single" w:color="auto" w:sz="4"/>
+          <w:right w:val="single" w:color="auto" w:sz="4"/>
+          <w:insideH w:val="single" w:color="auto" w:sz="4"/>
+          <w:insideV w:val="single" w:color="auto" w:sz="4"/>
+        </w:tblBorders>
+      </w:tblPr>
+      <w:tblGrid>
+        <w:gridCol w:w="2900"/>
+        <w:gridCol w:w="2500"/>
+        <w:gridCol w:w="2500"/>
+        <w:gridCol w:w="2512"/>
+      </w:tblGrid>
+      <w:tr>
+        <w:trPr>
+          <w:cantSplit/>
+          <w:tblHeader/>
+        </w:trPr>
+        <w:tc>
+          <w:tcPr>
+            <w:tcW w:type="dxa" w:w="2900"/>
+            <w:tcBorders>
+              <w:top w:val="single" w:color="BFBFBF" w:sz="4"/>
+              <w:left w:val="single" w:color="BFBFBF" w:sz="4"/>
+              <w:bottom w:val="single" w:color="BFBFBF" w:sz="4"/>
+              <w:right w:val="single" w:color="BFBFBF" w:sz="4"/>
+            </w:tcBorders>
+            <w:shd w:fill="1F3A5F" w:val="clear"/>
+            <w:tcMar>
+              <w:top w:type="dxa" w:w="25"/>
+              <w:left w:type="dxa" w:w="60"/>
+              <w:bottom w:type="dxa" w:w="25"/>
+              <w:right w:type="dxa" w:w="60"/>
+            </w:tcMar>
+          </w:tcPr>
+          <w:p>
+            <w:pPr>
+              <w:spacing w:after="0" w:line="220"/>
+            </w:pPr>
+            <w:r>
+              <w:rPr>
+                <w:rFonts w:ascii="Arial" w:cs="Arial" w:eastAsia="Arial" w:hAnsi="Arial"/>
+                <w:b/>
+                <w:bCs/>
+                <w:color w:val="FFFFFF"/>
+                <w:sz w:val="16"/>
+                <w:szCs w:val="16"/>
+              </w:rPr>
+              <w:t xml:space="preserve">TBI vs RBI (datos de [P], 2023–2056)</w:t>
+            </w:r>
+          </w:p>
+        </w:tc>
+        <w:tc>
+          <w:tcPr>
+            <w:tcW w:type="dxa" w:w="2500"/>
+            <w:tcBorders>
+              <w:top w:val="single" w:color="BFBFBF" w:sz="4"/>
+              <w:left w:val="single" w:color="BFBFBF" w:sz="4"/>
+              <w:bottom w:val="single" w:color="BFBFBF" w:sz="4"/>
+              <w:right w:val="single" w:color="BFBFBF" w:sz="4"/>
+            </w:tcBorders>
+            <w:shd w:fill="1F3A5F" w:val="clear"/>
+            <w:tcMar>
+              <w:top w:type="dxa" w:w="25"/>
+              <w:left w:type="dxa" w:w="60"/>
+              <w:bottom w:type="dxa" w:w="25"/>
+              <w:right w:type="dxa" w:w="60"/>
+            </w:tcMar>
+          </w:tcPr>
+          <w:p>
+            <w:pPr>
+              <w:spacing w:after="0" w:line="220"/>
+            </w:pPr>
+            <w:r>
+              <w:rPr>
+                <w:rFonts w:ascii="Arial" w:cs="Arial" w:eastAsia="Arial" w:hAnsi="Arial"/>
+                <w:b/>
+                <w:bCs/>
+                <w:color w:val="FFFFFF"/>
+                <w:sz w:val="16"/>
+                <w:szCs w:val="16"/>
+              </w:rPr>
+              <w:t xml:space="preserve">TBI</w:t>
+            </w:r>
+          </w:p>
+        </w:tc>
+        <w:tc>
+          <w:tcPr>
+            <w:tcW w:type="dxa" w:w="2500"/>
+            <w:tcBorders>
+              <w:top w:val="single" w:color="BFBFBF" w:sz="4"/>
+              <w:left w:val="single" w:color="BFBFBF" w:sz="4"/>
+              <w:bottom w:val="single" w:color="BFBFBF" w:sz="4"/>
+              <w:right w:val="single" w:color="BFBFBF" w:sz="4"/>
+            </w:tcBorders>
+            <w:shd w:fill="1F3A5F" w:val="clear"/>
+            <w:tcMar>
+              <w:top w:type="dxa" w:w="25"/>
+              <w:left w:type="dxa" w:w="60"/>
+              <w:bottom w:type="dxa" w:w="25"/>
+              <w:right w:type="dxa" w:w="60"/>
+            </w:tcMar>
+          </w:tcPr>
+          <w:p>
+            <w:pPr>
+              <w:spacing w:after="0" w:line="220"/>
+            </w:pPr>
+            <w:r>
+              <w:rPr>
+                <w:rFonts w:ascii="Arial" w:cs="Arial" w:eastAsia="Arial" w:hAnsi="Arial"/>
+                <w:b/>
+                <w:bCs/>
+                <w:color w:val="FFFFFF"/>
+                <w:sz w:val="16"/>
+                <w:szCs w:val="16"/>
+              </w:rPr>
+              <w:t xml:space="preserve">RBI estrategia 2 (filas recalculadas)</w:t>
+            </w:r>
+          </w:p>
+        </w:tc>
+        <w:tc>
+          <w:tcPr>
+            <w:tcW w:type="dxa" w:w="2512"/>
+            <w:tcBorders>
+              <w:top w:val="single" w:color="BFBFBF" w:sz="4"/>
+              <w:left w:val="single" w:color="BFBFBF" w:sz="4"/>
+              <w:bottom w:val="single" w:color="BFBFBF" w:sz="4"/>
+              <w:right w:val="single" w:color="BFBFBF" w:sz="4"/>
+            </w:tcBorders>
+            <w:shd w:fill="1F3A5F" w:val="clear"/>
+            <w:tcMar>
+              <w:top w:type="dxa" w:w="25"/>
+              <w:left w:type="dxa" w:w="60"/>
+              <w:bottom w:type="dxa" w:w="25"/>
+              <w:right w:type="dxa" w:w="60"/>
+            </w:tcMar>
+          </w:tcPr>
+          <w:p>
+            <w:pPr>
+              <w:spacing w:after="0" w:line="220"/>
+            </w:pPr>
+            <w:r>
+              <w:rPr>
+                <w:rFonts w:ascii="Arial" w:cs="Arial" w:eastAsia="Arial" w:hAnsi="Arial"/>
+                <w:b/>
+                <w:bCs/>
+                <w:color w:val="FFFFFF"/>
+                <w:sz w:val="16"/>
+                <w:szCs w:val="16"/>
+              </w:rPr>
+              <w:t xml:space="preserve">Reducción</w:t>
+            </w:r>
+          </w:p>
+        </w:tc>
+      </w:tr>
+      <w:tr>
+        <w:trPr>
+          <w:cantSplit/>
+          <w:tblHeader w:val="off"/>
+        </w:trPr>
+        <w:tc>
+          <w:tcPr>
+            <w:tcW w:type="dxa" w:w="2900"/>
+            <w:tcBorders>
+              <w:top w:val="single" w:color="BFBFBF" w:sz="4"/>
+              <w:left w:val="single" w:color="BFBFBF" w:sz="4"/>
+              <w:bottom w:val="single" w:color="BFBFBF" w:sz="4"/>
+              <w:right w:val="single" w:color="BFBFBF" w:sz="4"/>
+            </w:tcBorders>
+            <w:tcMar>
+              <w:top w:type="dxa" w:w="25"/>
+              <w:left w:type="dxa" w:w="60"/>
+              <w:bottom w:type="dxa" w:w="25"/>
+              <w:right w:type="dxa" w:w="60"/>
+            </w:tcMar>
+          </w:tcPr>
+          <w:p>
+            <w:pPr>
+              <w:spacing w:after="0" w:line="220"/>
+            </w:pPr>
+            <w:r>
+              <w:rPr>
+                <w:rFonts w:ascii="Arial" w:cs="Arial" w:eastAsia="Arial" w:hAnsi="Arial"/>
+                <w:b w:val="false"/>
+                <w:bCs w:val="false"/>
+                <w:sz w:val="16"/>
+                <w:szCs w:val="16"/>
+              </w:rPr>
+              <w:t xml:space="preserve">Inspección intrusiva (Tablas 9 y 7)</w:t>
+            </w:r>
+          </w:p>
+        </w:tc>
+        <w:tc>
+          <w:tcPr>
+            <w:tcW w:type="dxa" w:w="2500"/>
+            <w:tcBorders>
+              <w:top w:val="single" w:color="BFBFBF" w:sz="4"/>
+              <w:left w:val="single" w:color="BFBFBF" w:sz="4"/>
+              <w:bottom w:val="single" w:color="BFBFBF" w:sz="4"/>
+              <w:right w:val="single" w:color="BFBFBF" w:sz="4"/>
+            </w:tcBorders>
+            <w:tcMar>
+              <w:top w:type="dxa" w:w="25"/>
+              <w:left w:type="dxa" w:w="60"/>
+              <w:bottom w:type="dxa" w:w="25"/>
+              <w:right w:type="dxa" w:w="60"/>
+            </w:tcMar>
+          </w:tcPr>
+          <w:p>
+            <w:pPr>
+              <w:spacing w:after="0" w:line="220"/>
+            </w:pPr>
+            <w:r>
+              <w:rPr>
+                <w:rFonts w:ascii="Arial" w:cs="Arial" w:eastAsia="Arial" w:hAnsi="Arial"/>
+                <w:b w:val="false"/>
+                <w:bCs w:val="false"/>
+                <w:sz w:val="16"/>
+                <w:szCs w:val="16"/>
+              </w:rPr>
+              <w:t xml:space="preserve">43.360 USD</w:t>
+            </w:r>
+          </w:p>
+        </w:tc>
+        <w:tc>
+          <w:tcPr>
+            <w:tcW w:type="dxa" w:w="2500"/>
+            <w:tcBorders>
+              <w:top w:val="single" w:color="BFBFBF" w:sz="4"/>
+              <w:left w:val="single" w:color="BFBFBF" w:sz="4"/>
+              <w:bottom w:val="single" w:color="BFBFBF" w:sz="4"/>
+              <w:right w:val="single" w:color="BFBFBF" w:sz="4"/>
+            </w:tcBorders>
+            <w:tcMar>
+              <w:top w:type="dxa" w:w="25"/>
+              <w:left w:type="dxa" w:w="60"/>
+              <w:bottom w:type="dxa" w:w="25"/>
+              <w:right w:type="dxa" w:w="60"/>
+            </w:tcMar>
+          </w:tcPr>
+          <w:p>
+            <w:pPr>
+              <w:spacing w:after="0" w:line="220"/>
+            </w:pPr>
+            <w:r>
+              <w:rPr>
+                <w:rFonts w:ascii="Arial" w:cs="Arial" w:eastAsia="Arial" w:hAnsi="Arial"/>
+                <w:b w:val="false"/>
+                <w:bCs w:val="false"/>
+                <w:sz w:val="16"/>
+                <w:szCs w:val="16"/>
+              </w:rPr>
+              <w:t xml:space="preserve">1.410 USD</w:t>
+            </w:r>
+          </w:p>
+        </w:tc>
+        <w:tc>
+          <w:tcPr>
+            <w:tcW w:type="dxa" w:w="2512"/>
+            <w:tcBorders>
+              <w:top w:val="single" w:color="BFBFBF" w:sz="4"/>
+              <w:left w:val="single" w:color="BFBFBF" w:sz="4"/>
+              <w:bottom w:val="single" w:color="BFBFBF" w:sz="4"/>
+              <w:right w:val="single" w:color="BFBFBF" w:sz="4"/>
+            </w:tcBorders>
+            <w:tcMar>
+              <w:top w:type="dxa" w:w="25"/>
+              <w:left w:type="dxa" w:w="60"/>
+              <w:bottom w:type="dxa" w:w="25"/>
+              <w:right w:type="dxa" w:w="60"/>
+            </w:tcMar>
+          </w:tcPr>
+          <w:p>
+            <w:pPr>
+              <w:spacing w:after="0" w:line="220"/>
+            </w:pPr>
+            <w:r>
+              <w:rPr>
+                <w:rFonts w:ascii="Arial" w:cs="Arial" w:eastAsia="Arial" w:hAnsi="Arial"/>
+                <w:b w:val="false"/>
+                <w:bCs w:val="false"/>
+                <w:sz w:val="16"/>
+                <w:szCs w:val="16"/>
+              </w:rPr>
+              <w:t xml:space="preserve">96,7 %</w:t>
+            </w:r>
+          </w:p>
+        </w:tc>
+      </w:tr>
+      <w:tr>
+        <w:trPr>
+          <w:cantSplit/>
+          <w:tblHeader w:val="off"/>
+        </w:trPr>
+        <w:tc>
+          <w:tcPr>
+            <w:tcW w:type="dxa" w:w="2900"/>
+            <w:tcBorders>
+              <w:top w:val="single" w:color="BFBFBF" w:sz="4"/>
+              <w:left w:val="single" w:color="BFBFBF" w:sz="4"/>
+              <w:bottom w:val="single" w:color="BFBFBF" w:sz="4"/>
+              <w:right w:val="single" w:color="BFBFBF" w:sz="4"/>
+            </w:tcBorders>
+            <w:shd w:fill="F6F8FB" w:val="clear"/>
+            <w:tcMar>
+              <w:top w:type="dxa" w:w="25"/>
+              <w:left w:type="dxa" w:w="60"/>
+              <w:bottom w:type="dxa" w:w="25"/>
+              <w:right w:type="dxa" w:w="60"/>
+            </w:tcMar>
+          </w:tcPr>
+          <w:p>
+            <w:pPr>
+              <w:spacing w:after="0" w:line="220"/>
+            </w:pPr>
+            <w:r>
+              <w:rPr>
+                <w:rFonts w:ascii="Arial" w:cs="Arial" w:eastAsia="Arial" w:hAnsi="Arial"/>
+                <w:b w:val="false"/>
+                <w:bCs w:val="false"/>
+                <w:sz w:val="16"/>
+                <w:szCs w:val="16"/>
+              </w:rPr>
+              <w:t xml:space="preserve">Inspección no intrusiva (Tablas 10 y 8)</w:t>
+            </w:r>
+          </w:p>
+        </w:tc>
+        <w:tc>
+          <w:tcPr>
+            <w:tcW w:type="dxa" w:w="2500"/>
+            <w:tcBorders>
+              <w:top w:val="single" w:color="BFBFBF" w:sz="4"/>
+              <w:left w:val="single" w:color="BFBFBF" w:sz="4"/>
+              <w:bottom w:val="single" w:color="BFBFBF" w:sz="4"/>
+              <w:right w:val="single" w:color="BFBFBF" w:sz="4"/>
+            </w:tcBorders>
+            <w:shd w:fill="F6F8FB" w:val="clear"/>
+            <w:tcMar>
+              <w:top w:type="dxa" w:w="25"/>
+              <w:left w:type="dxa" w:w="60"/>
+              <w:bottom w:type="dxa" w:w="25"/>
+              <w:right w:type="dxa" w:w="60"/>
+            </w:tcMar>
+          </w:tcPr>
+          <w:p>
+            <w:pPr>
+              <w:spacing w:after="0" w:line="220"/>
+            </w:pPr>
+            <w:r>
+              <w:rPr>
+                <w:rFonts w:ascii="Arial" w:cs="Arial" w:eastAsia="Arial" w:hAnsi="Arial"/>
+                <w:b w:val="false"/>
+                <w:bCs w:val="false"/>
+                <w:sz w:val="16"/>
+                <w:szCs w:val="16"/>
+              </w:rPr>
+              <w:t xml:space="preserve">3.840 USD</w:t>
+            </w:r>
+          </w:p>
+        </w:tc>
+        <w:tc>
+          <w:tcPr>
+            <w:tcW w:type="dxa" w:w="2500"/>
+            <w:tcBorders>
+              <w:top w:val="single" w:color="BFBFBF" w:sz="4"/>
+              <w:left w:val="single" w:color="BFBFBF" w:sz="4"/>
+              <w:bottom w:val="single" w:color="BFBFBF" w:sz="4"/>
+              <w:right w:val="single" w:color="BFBFBF" w:sz="4"/>
+            </w:tcBorders>
+            <w:shd w:fill="F6F8FB" w:val="clear"/>
+            <w:tcMar>
+              <w:top w:type="dxa" w:w="25"/>
+              <w:left w:type="dxa" w:w="60"/>
+              <w:bottom w:type="dxa" w:w="25"/>
+              <w:right w:type="dxa" w:w="60"/>
+            </w:tcMar>
+          </w:tcPr>
+          <w:p>
+            <w:pPr>
+              <w:spacing w:after="0" w:line="220"/>
+            </w:pPr>
+            <w:r>
+              <w:rPr>
+                <w:rFonts w:ascii="Arial" w:cs="Arial" w:eastAsia="Arial" w:hAnsi="Arial"/>
+                <w:b w:val="false"/>
+                <w:bCs w:val="false"/>
+                <w:sz w:val="16"/>
+                <w:szCs w:val="16"/>
+              </w:rPr>
+              <w:t xml:space="preserve">1.170 USD</w:t>
+            </w:r>
+          </w:p>
+        </w:tc>
+        <w:tc>
+          <w:tcPr>
+            <w:tcW w:type="dxa" w:w="2512"/>
+            <w:tcBorders>
+              <w:top w:val="single" w:color="BFBFBF" w:sz="4"/>
+              <w:left w:val="single" w:color="BFBFBF" w:sz="4"/>
+              <w:bottom w:val="single" w:color="BFBFBF" w:sz="4"/>
+              <w:right w:val="single" w:color="BFBFBF" w:sz="4"/>
+            </w:tcBorders>
+            <w:shd w:fill="F6F8FB" w:val="clear"/>
+            <w:tcMar>
+              <w:top w:type="dxa" w:w="25"/>
+              <w:left w:type="dxa" w:w="60"/>
+              <w:bottom w:type="dxa" w:w="25"/>
+              <w:right w:type="dxa" w:w="60"/>
+            </w:tcMar>
+          </w:tcPr>
+          <w:p>
+            <w:pPr>
+              <w:spacing w:after="0" w:line="220"/>
+            </w:pPr>
+            <w:r>
+              <w:rPr>
+                <w:rFonts w:ascii="Arial" w:cs="Arial" w:eastAsia="Arial" w:hAnsi="Arial"/>
+                <w:b w:val="false"/>
+                <w:bCs w:val="false"/>
+                <w:sz w:val="16"/>
+                <w:szCs w:val="16"/>
+              </w:rPr>
+              <w:t xml:space="preserve">69,5 %</w:t>
+            </w:r>
+          </w:p>
+        </w:tc>
+      </w:tr>
+    </w:tbl>
+    <w:p>
+      <w:pPr>
+        <w:spacing w:after="30" w:before="20" w:line="250"/>
+      </w:pPr>
+      <w:r>
+        <w:rPr>
+          <w:rFonts w:ascii="Arial" w:cs="Arial" w:eastAsia="Arial" w:hAnsi="Arial"/>
+          <w:sz w:val="19"/>
+          <w:szCs w:val="19"/>
+        </w:rPr>
+        <w:t xml:space="preserve">No hay datos de Ecopetrol en el paper ni en los archivos: esta comparación es solo la del paper; con datos de GRB, cada fila del Excel calcula el costo anual TBI (C+L)/T_TBI y RBI (C+L)/T_RBI.</w:t>
+      </w:r>
+    </w:p>
+    <w:tbl>
+      <w:tblPr>
+        <w:tblW w:type="dxa" w:w="10412"/>
+        <w:tblBorders>
+          <w:top w:val="single" w:color="auto" w:sz="4"/>
+          <w:left w:val="single" w:color="auto" w:sz="4"/>
+          <w:bottom w:val="single" w:color="auto" w:sz="4"/>
+          <w:right w:val="single" w:color="auto" w:sz="4"/>
+          <w:insideH w:val="single" w:color="auto" w:sz="4"/>
+          <w:insideV w:val="single" w:color="auto" w:sz="4"/>
+        </w:tblBorders>
+      </w:tblPr>
+      <w:tblGrid>
+        <w:gridCol w:w="2800"/>
+        <w:gridCol w:w="2400"/>
+        <w:gridCol w:w="2400"/>
+        <w:gridCol w:w="2812"/>
+      </w:tblGrid>
+      <w:tr>
+        <w:trPr>
+          <w:cantSplit/>
+          <w:tblHeader/>
+        </w:trPr>
+        <w:tc>
+          <w:tcPr>
+            <w:tcW w:type="dxa" w:w="2800"/>
+            <w:tcBorders>
+              <w:top w:val="single" w:color="BFBFBF" w:sz="4"/>
+              <w:left w:val="single" w:color="BFBFBF" w:sz="4"/>
+              <w:bottom w:val="single" w:color="BFBFBF" w:sz="4"/>
+              <w:right w:val="single" w:color="BFBFBF" w:sz="4"/>
+            </w:tcBorders>
+            <w:shd w:fill="1F3A5F" w:val="clear"/>
+            <w:tcMar>
+              <w:top w:type="dxa" w:w="25"/>
+              <w:left w:type="dxa" w:w="60"/>
+              <w:bottom w:type="dxa" w:w="25"/>
+              <w:right w:type="dxa" w:w="60"/>
+            </w:tcMar>
+          </w:tcPr>
+          <w:p>
+            <w:pPr>
+              <w:spacing w:after="0" w:line="220"/>
+            </w:pPr>
+            <w:r>
+              <w:rPr>
+                <w:rFonts w:ascii="Arial" w:cs="Arial" w:eastAsia="Arial" w:hAnsi="Arial"/>
+                <w:b/>
+                <w:bCs/>
+                <w:color w:val="FFFFFF"/>
+                <w:sz w:val="16"/>
+                <w:szCs w:val="16"/>
+              </w:rPr>
+              <w:t xml:space="preserve">Sensibilidad (7 filas de ejemplo, N = 10)</w:t>
+            </w:r>
+          </w:p>
+        </w:tc>
+        <w:tc>
+          <w:tcPr>
+            <w:tcW w:type="dxa" w:w="2400"/>
+            <w:tcBorders>
+              <w:top w:val="single" w:color="BFBFBF" w:sz="4"/>
+              <w:left w:val="single" w:color="BFBFBF" w:sz="4"/>
+              <w:bottom w:val="single" w:color="BFBFBF" w:sz="4"/>
+              <w:right w:val="single" w:color="BFBFBF" w:sz="4"/>
+            </w:tcBorders>
+            <w:shd w:fill="1F3A5F" w:val="clear"/>
+            <w:tcMar>
+              <w:top w:type="dxa" w:w="25"/>
+              <w:left w:type="dxa" w:w="60"/>
+              <w:bottom w:type="dxa" w:w="25"/>
+              <w:right w:type="dxa" w:w="60"/>
+            </w:tcMar>
+          </w:tcPr>
+          <w:p>
+            <w:pPr>
+              <w:spacing w:after="0" w:line="220"/>
+            </w:pPr>
+            <w:r>
+              <w:rPr>
+                <w:rFonts w:ascii="Arial" w:cs="Arial" w:eastAsia="Arial" w:hAnsi="Arial"/>
+                <w:b/>
+                <w:bCs/>
+                <w:color w:val="FFFFFF"/>
+                <w:sz w:val="16"/>
+                <w:szCs w:val="16"/>
+              </w:rPr>
+              <w:t xml:space="preserve">SIR agregado</w:t>
+            </w:r>
+          </w:p>
+        </w:tc>
+        <w:tc>
+          <w:tcPr>
+            <w:tcW w:type="dxa" w:w="2400"/>
+            <w:tcBorders>
+              <w:top w:val="single" w:color="BFBFBF" w:sz="4"/>
+              <w:left w:val="single" w:color="BFBFBF" w:sz="4"/>
+              <w:bottom w:val="single" w:color="BFBFBF" w:sz="4"/>
+              <w:right w:val="single" w:color="BFBFBF" w:sz="4"/>
+            </w:tcBorders>
+            <w:shd w:fill="1F3A5F" w:val="clear"/>
+            <w:tcMar>
+              <w:top w:type="dxa" w:w="25"/>
+              <w:left w:type="dxa" w:w="60"/>
+              <w:bottom w:type="dxa" w:w="25"/>
+              <w:right w:type="dxa" w:w="60"/>
+            </w:tcMar>
+          </w:tcPr>
+          <w:p>
+            <w:pPr>
+              <w:spacing w:after="0" w:line="220"/>
+            </w:pPr>
+            <w:r>
+              <w:rPr>
+                <w:rFonts w:ascii="Arial" w:cs="Arial" w:eastAsia="Arial" w:hAnsi="Arial"/>
+                <w:b/>
+                <w:bCs/>
+                <w:color w:val="FFFFFF"/>
+                <w:sz w:val="16"/>
+                <w:szCs w:val="16"/>
+              </w:rPr>
+              <w:t xml:space="preserve">VAN (USD)</w:t>
+            </w:r>
+          </w:p>
+        </w:tc>
+        <w:tc>
+          <w:tcPr>
+            <w:tcW w:type="dxa" w:w="2812"/>
+            <w:tcBorders>
+              <w:top w:val="single" w:color="BFBFBF" w:sz="4"/>
+              <w:left w:val="single" w:color="BFBFBF" w:sz="4"/>
+              <w:bottom w:val="single" w:color="BFBFBF" w:sz="4"/>
+              <w:right w:val="single" w:color="BFBFBF" w:sz="4"/>
+            </w:tcBorders>
+            <w:shd w:fill="1F3A5F" w:val="clear"/>
+            <w:tcMar>
+              <w:top w:type="dxa" w:w="25"/>
+              <w:left w:type="dxa" w:w="60"/>
+              <w:bottom w:type="dxa" w:w="25"/>
+              <w:right w:type="dxa" w:w="60"/>
+            </w:tcMar>
+          </w:tcPr>
+          <w:p>
+            <w:pPr>
+              <w:spacing w:after="0" w:line="220"/>
+            </w:pPr>
+            <w:r>
+              <w:rPr>
+                <w:rFonts w:ascii="Arial" w:cs="Arial" w:eastAsia="Arial" w:hAnsi="Arial"/>
+                <w:b/>
+                <w:bCs/>
+                <w:color w:val="FFFFFF"/>
+                <w:sz w:val="16"/>
+                <w:szCs w:val="16"/>
+              </w:rPr>
+              <w:t xml:space="preserve">Nota</w:t>
+            </w:r>
+          </w:p>
+        </w:tc>
+      </w:tr>
+      <w:tr>
+        <w:trPr>
+          <w:cantSplit/>
+          <w:tblHeader w:val="off"/>
+        </w:trPr>
+        <w:tc>
+          <w:tcPr>
+            <w:tcW w:type="dxa" w:w="2800"/>
+            <w:tcBorders>
+              <w:top w:val="single" w:color="BFBFBF" w:sz="4"/>
+              <w:left w:val="single" w:color="BFBFBF" w:sz="4"/>
+              <w:bottom w:val="single" w:color="BFBFBF" w:sz="4"/>
+              <w:right w:val="single" w:color="BFBFBF" w:sz="4"/>
+            </w:tcBorders>
+            <w:tcMar>
+              <w:top w:type="dxa" w:w="25"/>
+              <w:left w:type="dxa" w:w="60"/>
+              <w:bottom w:type="dxa" w:w="25"/>
+              <w:right w:type="dxa" w:w="60"/>
+            </w:tcMar>
+          </w:tcPr>
+          <w:p>
+            <w:pPr>
+              <w:spacing w:after="0" w:line="220"/>
+            </w:pPr>
+            <w:r>
+              <w:rPr>
+                <w:rFonts w:ascii="Arial" w:cs="Arial" w:eastAsia="Arial" w:hAnsi="Arial"/>
+                <w:b w:val="false"/>
+                <w:bCs w:val="false"/>
+                <w:sz w:val="16"/>
+                <w:szCs w:val="16"/>
+              </w:rPr>
+              <w:t xml:space="preserve">WACC 6 % / 8 % / 10 % / 12 % / 15 % / 20 %</w:t>
+            </w:r>
+          </w:p>
+        </w:tc>
+        <w:tc>
+          <w:tcPr>
+            <w:tcW w:type="dxa" w:w="2400"/>
+            <w:tcBorders>
+              <w:top w:val="single" w:color="BFBFBF" w:sz="4"/>
+              <w:left w:val="single" w:color="BFBFBF" w:sz="4"/>
+              <w:bottom w:val="single" w:color="BFBFBF" w:sz="4"/>
+              <w:right w:val="single" w:color="BFBFBF" w:sz="4"/>
+            </w:tcBorders>
+            <w:tcMar>
+              <w:top w:type="dxa" w:w="25"/>
+              <w:left w:type="dxa" w:w="60"/>
+              <w:bottom w:type="dxa" w:w="25"/>
+              <w:right w:type="dxa" w:w="60"/>
+            </w:tcMar>
+          </w:tcPr>
+          <w:p>
+            <w:pPr>
+              <w:spacing w:after="0" w:line="220"/>
+            </w:pPr>
+            <w:r>
+              <w:rPr>
+                <w:rFonts w:ascii="Arial" w:cs="Arial" w:eastAsia="Arial" w:hAnsi="Arial"/>
+                <w:b w:val="false"/>
+                <w:bCs w:val="false"/>
+                <w:sz w:val="16"/>
+                <w:szCs w:val="16"/>
+              </w:rPr>
+              <w:t xml:space="preserve">3,17 / 2,89 / 2,64 / 2,43 / 2,16 / 1,80</w:t>
+            </w:r>
+          </w:p>
+        </w:tc>
+        <w:tc>
+          <w:tcPr>
+            <w:tcW w:type="dxa" w:w="2400"/>
+            <w:tcBorders>
+              <w:top w:val="single" w:color="BFBFBF" w:sz="4"/>
+              <w:left w:val="single" w:color="BFBFBF" w:sz="4"/>
+              <w:bottom w:val="single" w:color="BFBFBF" w:sz="4"/>
+              <w:right w:val="single" w:color="BFBFBF" w:sz="4"/>
+            </w:tcBorders>
+            <w:tcMar>
+              <w:top w:type="dxa" w:w="25"/>
+              <w:left w:type="dxa" w:w="60"/>
+              <w:bottom w:type="dxa" w:w="25"/>
+              <w:right w:type="dxa" w:w="60"/>
+            </w:tcMar>
+          </w:tcPr>
+          <w:p>
+            <w:pPr>
+              <w:spacing w:after="0" w:line="220"/>
+            </w:pPr>
+            <w:r>
+              <w:rPr>
+                <w:rFonts w:ascii="Arial" w:cs="Arial" w:eastAsia="Arial" w:hAnsi="Arial"/>
+                <w:b w:val="false"/>
+                <w:bCs w:val="false"/>
+                <w:sz w:val="16"/>
+                <w:szCs w:val="16"/>
+              </w:rPr>
+              <w:t xml:space="preserve">1,00 M / 0,87 M / 0,76 M / 0,66 M / 0,54 M / 0,37 M</w:t>
+            </w:r>
+          </w:p>
+        </w:tc>
+        <w:tc>
+          <w:tcPr>
+            <w:tcW w:type="dxa" w:w="2812"/>
+            <w:tcBorders>
+              <w:top w:val="single" w:color="BFBFBF" w:sz="4"/>
+              <w:left w:val="single" w:color="BFBFBF" w:sz="4"/>
+              <w:bottom w:val="single" w:color="BFBFBF" w:sz="4"/>
+              <w:right w:val="single" w:color="BFBFBF" w:sz="4"/>
+            </w:tcBorders>
+            <w:tcMar>
+              <w:top w:type="dxa" w:w="25"/>
+              <w:left w:type="dxa" w:w="60"/>
+              <w:bottom w:type="dxa" w:w="25"/>
+              <w:right w:type="dxa" w:w="60"/>
+            </w:tcMar>
+          </w:tcPr>
+          <w:p>
+            <w:pPr>
+              <w:spacing w:after="0" w:line="220"/>
+            </w:pPr>
+            <w:r>
+              <w:rPr>
+                <w:rFonts w:ascii="Arial" w:cs="Arial" w:eastAsia="Arial" w:hAnsi="Arial"/>
+                <w:b w:val="false"/>
+                <w:bCs w:val="false"/>
+                <w:sz w:val="16"/>
+                <w:szCs w:val="16"/>
+              </w:rPr>
+              <w:t xml:space="preserve">SIR &gt; 1 en todo el rango</w:t>
+            </w:r>
+          </w:p>
+        </w:tc>
+      </w:tr>
+      <w:tr>
+        <w:trPr>
+          <w:cantSplit/>
+          <w:tblHeader w:val="off"/>
+        </w:trPr>
+        <w:tc>
+          <w:tcPr>
+            <w:tcW w:type="dxa" w:w="2800"/>
+            <w:tcBorders>
+              <w:top w:val="single" w:color="BFBFBF" w:sz="4"/>
+              <w:left w:val="single" w:color="BFBFBF" w:sz="4"/>
+              <w:bottom w:val="single" w:color="BFBFBF" w:sz="4"/>
+              <w:right w:val="single" w:color="BFBFBF" w:sz="4"/>
+            </w:tcBorders>
+            <w:shd w:fill="F6F8FB" w:val="clear"/>
+            <w:tcMar>
+              <w:top w:type="dxa" w:w="25"/>
+              <w:left w:type="dxa" w:w="60"/>
+              <w:bottom w:type="dxa" w:w="25"/>
+              <w:right w:type="dxa" w:w="60"/>
+            </w:tcMar>
+          </w:tcPr>
+          <w:p>
+            <w:pPr>
+              <w:spacing w:after="0" w:line="220"/>
+            </w:pPr>
+            <w:r>
+              <w:rPr>
+                <w:rFonts w:ascii="Arial" w:cs="Arial" w:eastAsia="Arial" w:hAnsi="Arial"/>
+                <w:b w:val="false"/>
+                <w:bCs w:val="false"/>
+                <w:sz w:val="16"/>
+                <w:szCs w:val="16"/>
+              </w:rPr>
+              <w:t xml:space="preserve">CR × 0,8 / 1,0 / 1,25 / 1,5</w:t>
+            </w:r>
+          </w:p>
+        </w:tc>
+        <w:tc>
+          <w:tcPr>
+            <w:tcW w:type="dxa" w:w="2400"/>
+            <w:tcBorders>
+              <w:top w:val="single" w:color="BFBFBF" w:sz="4"/>
+              <w:left w:val="single" w:color="BFBFBF" w:sz="4"/>
+              <w:bottom w:val="single" w:color="BFBFBF" w:sz="4"/>
+              <w:right w:val="single" w:color="BFBFBF" w:sz="4"/>
+            </w:tcBorders>
+            <w:shd w:fill="F6F8FB" w:val="clear"/>
+            <w:tcMar>
+              <w:top w:type="dxa" w:w="25"/>
+              <w:left w:type="dxa" w:w="60"/>
+              <w:bottom w:type="dxa" w:w="25"/>
+              <w:right w:type="dxa" w:w="60"/>
+            </w:tcMar>
+          </w:tcPr>
+          <w:p>
+            <w:pPr>
+              <w:spacing w:after="0" w:line="220"/>
+            </w:pPr>
+            <w:r>
+              <w:rPr>
+                <w:rFonts w:ascii="Arial" w:cs="Arial" w:eastAsia="Arial" w:hAnsi="Arial"/>
+                <w:b w:val="false"/>
+                <w:bCs w:val="false"/>
+                <w:sz w:val="16"/>
+                <w:szCs w:val="16"/>
+              </w:rPr>
+              <w:t xml:space="preserve">2,62 / 2,64 / 2,95 / 3,03</w:t>
+            </w:r>
+          </w:p>
+        </w:tc>
+        <w:tc>
+          <w:tcPr>
+            <w:tcW w:type="dxa" w:w="2400"/>
+            <w:tcBorders>
+              <w:top w:val="single" w:color="BFBFBF" w:sz="4"/>
+              <w:left w:val="single" w:color="BFBFBF" w:sz="4"/>
+              <w:bottom w:val="single" w:color="BFBFBF" w:sz="4"/>
+              <w:right w:val="single" w:color="BFBFBF" w:sz="4"/>
+            </w:tcBorders>
+            <w:shd w:fill="F6F8FB" w:val="clear"/>
+            <w:tcMar>
+              <w:top w:type="dxa" w:w="25"/>
+              <w:left w:type="dxa" w:w="60"/>
+              <w:bottom w:type="dxa" w:w="25"/>
+              <w:right w:type="dxa" w:w="60"/>
+            </w:tcMar>
+          </w:tcPr>
+          <w:p>
+            <w:pPr>
+              <w:spacing w:after="0" w:line="220"/>
+            </w:pPr>
+            <w:r>
+              <w:rPr>
+                <w:rFonts w:ascii="Arial" w:cs="Arial" w:eastAsia="Arial" w:hAnsi="Arial"/>
+                <w:b w:val="false"/>
+                <w:bCs w:val="false"/>
+                <w:sz w:val="16"/>
+                <w:szCs w:val="16"/>
+              </w:rPr>
+              <w:t xml:space="preserve">0,75 M / 0,76 M / 0,90 M / 0,94 M</w:t>
+            </w:r>
+          </w:p>
+        </w:tc>
+        <w:tc>
+          <w:tcPr>
+            <w:tcW w:type="dxa" w:w="2812"/>
+            <w:tcBorders>
+              <w:top w:val="single" w:color="BFBFBF" w:sz="4"/>
+              <w:left w:val="single" w:color="BFBFBF" w:sz="4"/>
+              <w:bottom w:val="single" w:color="BFBFBF" w:sz="4"/>
+              <w:right w:val="single" w:color="BFBFBF" w:sz="4"/>
+            </w:tcBorders>
+            <w:shd w:fill="F6F8FB" w:val="clear"/>
+            <w:tcMar>
+              <w:top w:type="dxa" w:w="25"/>
+              <w:left w:type="dxa" w:w="60"/>
+              <w:bottom w:type="dxa" w:w="25"/>
+              <w:right w:type="dxa" w:w="60"/>
+            </w:tcMar>
+          </w:tcPr>
+          <w:p>
+            <w:pPr>
+              <w:spacing w:after="0" w:line="220"/>
+            </w:pPr>
+            <w:r>
+              <w:rPr>
+                <w:rFonts w:ascii="Arial" w:cs="Arial" w:eastAsia="Arial" w:hAnsi="Arial"/>
+                <w:b w:val="false"/>
+                <w:bCs w:val="false"/>
+                <w:sz w:val="16"/>
+                <w:szCs w:val="16"/>
+              </w:rPr>
+              <w:t xml:space="preserve">Riesgo inicial 33 k → 65 k USD/año; equipos sobre objetivo 1 → 2</w:t>
+            </w:r>
+          </w:p>
+        </w:tc>
+      </w:tr>
+    </w:tbl>
+    <w:p>
+      <w:pPr>
+        <w:spacing w:after="20" w:before="30" w:line="250"/>
+      </w:pPr>
+      <w:r>
+        <w:rPr>
+          <w:rFonts w:ascii="Arial" w:cs="Arial" w:eastAsia="Arial" w:hAnsi="Arial"/>
+          <w:b/>
+          <w:bCs/>
+          <w:sz w:val="19"/>
+          <w:szCs w:val="19"/>
+        </w:rPr>
+        <w:t xml:space="preserve">Weibull (modelo complementario, no en [P] ni implementado):</w:t>
+      </w:r>
+      <w:r>
+        <w:rPr>
+          <w:rFonts w:ascii="Arial" w:cs="Arial" w:eastAsia="Arial" w:hAnsi="Arial"/>
+          <w:sz w:val="19"/>
+          <w:szCs w:val="19"/>
+        </w:rPr>
+        <w:t xml:space="preserve"> F(t) = 1 − exp[−(t/η)^β], con η y β ajustados a datos de falla estructurados según ISO 14224, sirve para contrastar el GFF genérico; no reemplaza la POF de API 581. La sensibilidad de efectividad NDE se obtiene cambiando la columna de efectividad A–E por fila.</w:t>
+      </w:r>
+    </w:p>
+    <w:p>
+      <w:pPr>
+        <w:pStyle w:val="Heading2"/>
+        <w:keepNext/>
+        <w:pBdr>
+          <w:bottom w:val="single" w:color="1F3A5F" w:sz="6" w:space="1"/>
+        </w:pBdr>
+        <w:spacing w:after="50" w:before="110"/>
+      </w:pPr>
+      <w:r>
+        <w:rPr>
+          <w:rFonts w:ascii="Arial" w:cs="Arial" w:eastAsia="Arial" w:hAnsi="Arial"/>
+          <w:b/>
+          <w:bCs/>
+          <w:color w:val="1F3A5F"/>
+          <w:sz w:val="21"/>
+          <w:szCs w:val="21"/>
+        </w:rPr>
+        <w:t xml:space="preserve">11. Glosario</w:t>
       </w:r>
     </w:p>
     <w:p>
@@ -9343,7 +11600,61 @@
           <w:sz w:val="16"/>
           <w:szCs w:val="16"/>
         </w:rPr>
-        <w:t xml:space="preserve"> valor de la vida estadística.</w:t>
+        <w:t xml:space="preserve"> valor de la vida estadística. </w:t>
+      </w:r>
+      <w:r>
+        <w:rPr>
+          <w:rFonts w:ascii="Arial" w:cs="Arial" w:eastAsia="Arial" w:hAnsi="Arial"/>
+          <w:b/>
+          <w:bCs/>
+          <w:sz w:val="16"/>
+          <w:szCs w:val="16"/>
+        </w:rPr>
+        <w:t xml:space="preserve">NDE:</w:t>
+      </w:r>
+      <w:r>
+        <w:rPr>
+          <w:rFonts w:ascii="Arial" w:cs="Arial" w:eastAsia="Arial" w:hAnsi="Arial"/>
+          <w:sz w:val="16"/>
+          <w:szCs w:val="16"/>
+        </w:rPr>
+        <w:t xml:space="preserve"> ensayo no destructivo. </w:t>
+      </w:r>
+      <w:r>
+        <w:rPr>
+          <w:rFonts w:ascii="Arial" w:cs="Arial" w:eastAsia="Arial" w:hAnsi="Arial"/>
+          <w:b/>
+          <w:bCs/>
+          <w:sz w:val="16"/>
+          <w:szCs w:val="16"/>
+        </w:rPr>
+        <w:t xml:space="preserve">RUL:</w:t>
+      </w:r>
+      <w:r>
+        <w:rPr>
+          <w:rFonts w:ascii="Arial" w:cs="Arial" w:eastAsia="Arial" w:hAnsi="Arial"/>
+          <w:sz w:val="16"/>
+          <w:szCs w:val="16"/>
+        </w:rPr>
+        <w:t xml:space="preserve"> vida remanente útil. </w:t>
+      </w:r>
+      <w:r>
+        <w:rPr>
+          <w:rFonts w:ascii="Arial" w:cs="Arial" w:eastAsia="Arial" w:hAnsi="Arial"/>
+          <w:b/>
+          <w:bCs/>
+          <w:sz w:val="16"/>
+          <w:szCs w:val="16"/>
+        </w:rPr>
+        <w:t xml:space="preserve">WACC:</w:t>
+      </w:r>
+      <w:r>
+        <w:rPr>
+          <w:rFonts w:ascii="Arial" w:cs="Arial" w:eastAsia="Arial" w:hAnsi="Arial"/>
+          <w:sz w:val="16"/>
+          <w:szCs w:val="16"/>
+        </w:rPr>
+        <w:t xml:space="preserve"> costo promedio de capital (tasa de descuento).</w:t>
       </w:r>
     </w:p>
     <w:sectPr>

</xml_diff>

<commit_message>
Add NDE effectiveness and life-extension (RUL) sensitivities; Bayes/Weibull note
Co-Authored-By: Claude Sonnet 5.5 <noreply@anthropic.com>
Claude-Session: https://claude.ai/code/session_01HcbnVyHFWjMv5iL4iw2dZn
</commit_message>
<xml_diff>
--- a/RBI_Barrancabermeja/RBI_Metodologia_Barrancabermeja.docx
+++ b/RBI_Barrancabermeja/RBI_Metodologia_Barrancabermeja.docx
@@ -5408,6 +5408,52 @@
           <w:szCs w:val="22"/>
         </w:rPr>
         <w:t xml:space="preserve"> ⇒ costo de reparación/reemplazo en I0 y DF = 1 tras reparar. Aprobar o rechazar se valora con Ec. 13.</w:t>
+      </w:r>
+    </w:p>
+    <w:p>
+      <w:pPr>
+        <w:pStyle w:val="ListParagraph"/>
+        <w:numPr>
+          <w:ilvl w:val="0"/>
+          <w:numId w:val="2"/>
+        </w:numPr>
+        <w:spacing w:after="40" w:line="250"/>
+      </w:pPr>
+      <w:r>
+        <w:rPr>
+          <w:rFonts w:ascii="Arial" w:cs="Arial" w:eastAsia="Arial" w:hAnsi="Arial"/>
+          <w:b/>
+          <w:bCs/>
+          <w:sz w:val="22"/>
+          <w:szCs w:val="22"/>
+        </w:rPr>
+        <w:t xml:space="preserve">Bayes y Weibull.</w:t>
+      </w:r>
+      <w:r>
+        <w:rPr>
+          <w:rFonts w:ascii="Arial" w:cs="Arial" w:eastAsia="Arial" w:hAnsi="Arial"/>
+          <w:sz w:val="22"/>
+          <w:szCs w:val="22"/>
+        </w:rPr>
+        <w:t xml:space="preserve"> La actualización bayesiana del DF de adelgazamiento es de [P Ec.7] y API 581 (posteriores según efectividad y número de inspecciones); no se reproduce aquí. Weibull, F(t) = 1 − exp[−(t/η)^β] con datos de falla estructurados según ISO 14224, es un </w:t>
+      </w:r>
+      <w:r>
+        <w:rPr>
+          <w:rFonts w:ascii="Arial" w:cs="Arial" w:eastAsia="Arial" w:hAnsi="Arial"/>
+          <w:b/>
+          <w:bCs/>
+          <w:sz w:val="22"/>
+          <w:szCs w:val="22"/>
+        </w:rPr>
+        <w:t xml:space="preserve">modelo complementario</w:t>
+      </w:r>
+      <w:r>
+        <w:rPr>
+          <w:rFonts w:ascii="Arial" w:cs="Arial" w:eastAsia="Arial" w:hAnsi="Arial"/>
+          <w:sz w:val="22"/>
+          <w:szCs w:val="22"/>
+        </w:rPr>
+        <w:t xml:space="preserve"> [M] para contrastar el GFF genérico; no está implementado ni en [P] ni en API 581.</w:t>
       </w:r>
     </w:p>
     <w:p>
@@ -6235,6 +6281,213 @@
                 <w:szCs w:val="19"/>
               </w:rPr>
               <w:t xml:space="preserve">Más CR ⇒ más riesgo evitado; equipos sobre objetivo 1 → 2</w:t>
+            </w:r>
+          </w:p>
+        </w:tc>
+      </w:tr>
+      <w:tr>
+        <w:trPr>
+          <w:cantSplit/>
+          <w:tblHeader w:val="off"/>
+        </w:trPr>
+        <w:tc>
+          <w:tcPr>
+            <w:tcW w:type="dxa" w:w="3075"/>
+            <w:tcBorders>
+              <w:top w:val="single" w:color="BFBFBF" w:sz="4"/>
+              <w:left w:val="single" w:color="BFBFBF" w:sz="4"/>
+              <w:bottom w:val="single" w:color="BFBFBF" w:sz="4"/>
+              <w:right w:val="single" w:color="BFBFBF" w:sz="4"/>
+            </w:tcBorders>
+            <w:shd w:fill="F6F8FB" w:val="clear"/>
+            <w:tcMar>
+              <w:top w:type="dxa" w:w="40"/>
+              <w:left w:type="dxa" w:w="60"/>
+              <w:bottom w:type="dxa" w:w="40"/>
+              <w:right w:type="dxa" w:w="60"/>
+            </w:tcMar>
+          </w:tcPr>
+          <w:p>
+            <w:pPr>
+              <w:spacing w:after="0" w:line="220"/>
+            </w:pPr>
+            <w:r>
+              <w:rPr>
+                <w:rFonts w:ascii="Arial" w:cs="Arial" w:eastAsia="Arial" w:hAnsi="Arial"/>
+                <w:b w:val="false"/>
+                <w:bCs w:val="false"/>
+                <w:sz w:val="19"/>
+                <w:szCs w:val="19"/>
+              </w:rPr>
+              <w:t xml:space="preserve">Efectividad NDE A / D en todos los equipos (costo relativo de [P Tabla 4])</w:t>
+            </w:r>
+          </w:p>
+        </w:tc>
+        <w:tc>
+          <w:tcPr>
+            <w:tcW w:type="dxa" w:w="3541"/>
+            <w:tcBorders>
+              <w:top w:val="single" w:color="BFBFBF" w:sz="4"/>
+              <w:left w:val="single" w:color="BFBFBF" w:sz="4"/>
+              <w:bottom w:val="single" w:color="BFBFBF" w:sz="4"/>
+              <w:right w:val="single" w:color="BFBFBF" w:sz="4"/>
+            </w:tcBorders>
+            <w:shd w:fill="F6F8FB" w:val="clear"/>
+            <w:tcMar>
+              <w:top w:type="dxa" w:w="40"/>
+              <w:left w:type="dxa" w:w="60"/>
+              <w:bottom w:type="dxa" w:w="40"/>
+              <w:right w:type="dxa" w:w="60"/>
+            </w:tcMar>
+          </w:tcPr>
+          <w:p>
+            <w:pPr>
+              <w:spacing w:after="0" w:line="220"/>
+            </w:pPr>
+            <w:r>
+              <w:rPr>
+                <w:rFonts w:ascii="Arial" w:cs="Arial" w:eastAsia="Arial" w:hAnsi="Arial"/>
+                <w:b w:val="false"/>
+                <w:bCs w:val="false"/>
+                <w:sz w:val="19"/>
+                <w:szCs w:val="19"/>
+              </w:rPr>
+              <w:t xml:space="preserve">2,50 (0,75 M) / 2,92 (0,78 M)</w:t>
+            </w:r>
+          </w:p>
+        </w:tc>
+        <w:tc>
+          <w:tcPr>
+            <w:tcW w:type="dxa" w:w="3895"/>
+            <w:tcBorders>
+              <w:top w:val="single" w:color="BFBFBF" w:sz="4"/>
+              <w:left w:val="single" w:color="BFBFBF" w:sz="4"/>
+              <w:bottom w:val="single" w:color="BFBFBF" w:sz="4"/>
+              <w:right w:val="single" w:color="BFBFBF" w:sz="4"/>
+            </w:tcBorders>
+            <w:shd w:fill="F6F8FB" w:val="clear"/>
+            <w:tcMar>
+              <w:top w:type="dxa" w:w="40"/>
+              <w:left w:type="dxa" w:w="60"/>
+              <w:bottom w:type="dxa" w:w="40"/>
+              <w:right w:type="dxa" w:w="60"/>
+            </w:tcMar>
+          </w:tcPr>
+          <w:p>
+            <w:pPr>
+              <w:spacing w:after="0" w:line="220"/>
+            </w:pPr>
+            <w:r>
+              <w:rPr>
+                <w:rFonts w:ascii="Arial" w:cs="Arial" w:eastAsia="Arial" w:hAnsi="Arial"/>
+                <w:b w:val="false"/>
+                <w:bCs w:val="false"/>
+                <w:sz w:val="19"/>
+                <w:szCs w:val="19"/>
+              </w:rPr>
+              <w:t xml:space="preserve">D abarata la inspección pero deja 11.411 vs 1.804 USD/año de riesgo residual: elegir junto con el objetivo de riesgo</w:t>
+            </w:r>
+          </w:p>
+        </w:tc>
+      </w:tr>
+      <w:tr>
+        <w:trPr>
+          <w:cantSplit/>
+          <w:tblHeader w:val="off"/>
+        </w:trPr>
+        <w:tc>
+          <w:tcPr>
+            <w:tcW w:type="dxa" w:w="3075"/>
+            <w:tcBorders>
+              <w:top w:val="single" w:color="BFBFBF" w:sz="4"/>
+              <w:left w:val="single" w:color="BFBFBF" w:sz="4"/>
+              <w:bottom w:val="single" w:color="BFBFBF" w:sz="4"/>
+              <w:right w:val="single" w:color="BFBFBF" w:sz="4"/>
+            </w:tcBorders>
+            <w:tcMar>
+              <w:top w:type="dxa" w:w="40"/>
+              <w:left w:type="dxa" w:w="60"/>
+              <w:bottom w:type="dxa" w:w="40"/>
+              <w:right w:type="dxa" w:w="60"/>
+            </w:tcMar>
+          </w:tcPr>
+          <w:p>
+            <w:pPr>
+              <w:spacing w:after="0" w:line="220"/>
+            </w:pPr>
+            <w:r>
+              <w:rPr>
+                <w:rFonts w:ascii="Arial" w:cs="Arial" w:eastAsia="Arial" w:hAnsi="Arial"/>
+                <w:b w:val="false"/>
+                <w:bCs w:val="false"/>
+                <w:sz w:val="19"/>
+                <w:szCs w:val="19"/>
+              </w:rPr>
+              <w:t xml:space="preserve">Vida extendida ΔRUL 2 / 5 / 10 años [M]</w:t>
+            </w:r>
+          </w:p>
+        </w:tc>
+        <w:tc>
+          <w:tcPr>
+            <w:tcW w:type="dxa" w:w="3541"/>
+            <w:tcBorders>
+              <w:top w:val="single" w:color="BFBFBF" w:sz="4"/>
+              <w:left w:val="single" w:color="BFBFBF" w:sz="4"/>
+              <w:bottom w:val="single" w:color="BFBFBF" w:sz="4"/>
+              <w:right w:val="single" w:color="BFBFBF" w:sz="4"/>
+            </w:tcBorders>
+            <w:tcMar>
+              <w:top w:type="dxa" w:w="40"/>
+              <w:left w:type="dxa" w:w="60"/>
+              <w:bottom w:type="dxa" w:w="40"/>
+              <w:right w:type="dxa" w:w="60"/>
+            </w:tcMar>
+          </w:tcPr>
+          <w:p>
+            <w:pPr>
+              <w:spacing w:after="0" w:line="220"/>
+            </w:pPr>
+            <w:r>
+              <w:rPr>
+                <w:rFonts w:ascii="Arial" w:cs="Arial" w:eastAsia="Arial" w:hAnsi="Arial"/>
+                <w:b w:val="false"/>
+                <w:bCs w:val="false"/>
+                <w:sz w:val="19"/>
+                <w:szCs w:val="19"/>
+              </w:rPr>
+              <w:t xml:space="preserve">VAN 0,81 M / 0,86 M / 0,93 M</w:t>
+            </w:r>
+          </w:p>
+        </w:tc>
+        <w:tc>
+          <w:tcPr>
+            <w:tcW w:type="dxa" w:w="3895"/>
+            <w:tcBorders>
+              <w:top w:val="single" w:color="BFBFBF" w:sz="4"/>
+              <w:left w:val="single" w:color="BFBFBF" w:sz="4"/>
+              <w:bottom w:val="single" w:color="BFBFBF" w:sz="4"/>
+              <w:right w:val="single" w:color="BFBFBF" w:sz="4"/>
+            </w:tcBorders>
+            <w:tcMar>
+              <w:top w:type="dxa" w:w="40"/>
+              <w:left w:type="dxa" w:w="60"/>
+              <w:bottom w:type="dxa" w:w="40"/>
+              <w:right w:type="dxa" w:w="60"/>
+            </w:tcMar>
+          </w:tcPr>
+          <w:p>
+            <w:pPr>
+              <w:spacing w:after="0" w:line="220"/>
+            </w:pPr>
+            <w:r>
+              <w:rPr>
+                <w:rFonts w:ascii="Arial" w:cs="Arial" w:eastAsia="Arial" w:hAnsi="Arial"/>
+                <w:b w:val="false"/>
+                <w:bCs w:val="false"/>
+                <w:sz w:val="19"/>
+                <w:szCs w:val="19"/>
+              </w:rPr>
+              <w:t xml:space="preserve">Reemplazo diferido sobre 270.000 USD de reparaciones cargadas: C·[1 − (1+r)^−ΔRUL]</w:t>
             </w:r>
           </w:p>
         </w:tc>

</xml_diff>